<commit_message>
Report: web modules, Paper Decoder, Timeline, DeepSeek fresh-clone run, doctor, 42 tests
Co-Authored-By: Claude Opus 5.5 <noreply@anthropic.com>
</commit_message>
<xml_diff>
--- a/report/Newsren_Technology_Report.docx
+++ b/report/Newsren_Technology_Report.docx
@@ -27,7 +27,7 @@
           <w:sz w:val="26"/>
           <w:szCs w:val="26"/>
         </w:rPr>
-        <w:t xml:space="preserve">An agentic “Launch Reality Check” prototype: Follow a Topic, evidence verification, Ask Newsren and News-to-Learning</w:t>
+        <w:t xml:space="preserve">An agentic “Launch Reality Check” prototype: Follow a Topic, evidence verification, Ask Newsren, News-to-Learning, Paper Decoder and Evolution Timeline</w:t>
       </w:r>
     </w:p>
     <w:p>
@@ -87,7 +87,7 @@
         <w:spacing w:after="120"/>
       </w:pPr>
       <w:r>
-        <w:t xml:space="preserve">The prototype is a working command-line system in plain Python (about 1,200 lines, no third-party packages) that runs on live sources. It implements three of the plan’s “build first” features around one saved question:</w:t>
+        <w:t xml:space="preserve">The prototype is a working system in plain Python (about 2,500 lines, no third-party packages) that runs on live sources, from the command line or a local web page. It implements the plan’s three “build first” features around one saved question, plus two Technology tools from §3:</w:t>
       </w:r>
     </w:p>
     <w:p>
@@ -148,6 +148,65 @@
       </w:r>
       <w:r>
         <w:t xml:space="preserve"> (§2.3): one verified briefing becomes material for a student, an educator and a professional.</w:t>
+      </w:r>
+    </w:p>
+    <w:p>
+      <w:pPr>
+        <w:pStyle w:val="ListParagraph"/>
+        <w:numPr>
+          <w:ilvl w:val="0"/>
+          <w:numId w:val="2"/>
+        </w:numPr>
+        <w:spacing w:after="60"/>
+      </w:pPr>
+      <w:r>
+        <w:rPr>
+          <w:b/>
+          <w:bCs/>
+        </w:rPr>
+        <w:t xml:space="preserve">Research Paper Decoder</w:t>
+      </w:r>
+      <w:r>
+        <w:t xml:space="preserve"> (§3): an arXiv paper becomes hypothesis, method, findings, limitations and possible applications, cited and marked as a preprint.</w:t>
+      </w:r>
+    </w:p>
+    <w:p>
+      <w:pPr>
+        <w:pStyle w:val="ListParagraph"/>
+        <w:numPr>
+          <w:ilvl w:val="0"/>
+          <w:numId w:val="2"/>
+        </w:numPr>
+        <w:spacing w:after="60"/>
+      </w:pPr>
+      <w:r>
+        <w:rPr>
+          <w:b/>
+          <w:bCs/>
+        </w:rPr>
+        <w:t xml:space="preserve">Technology Evolution Timeline</w:t>
+      </w:r>
+      <w:r>
+        <w:t xml:space="preserve"> (§2.2, §3): developer release, independent evaluations and label changes in order, built from the record of checked sources without any model calls.</w:t>
+      </w:r>
+    </w:p>
+    <w:p>
+      <w:pPr>
+        <w:spacing w:after="120"/>
+      </w:pPr>
+      <w:r>
+        <w:t xml:space="preserve">A local web page lays these out as the plan’s site would (§5): four verticals in the top bar with only Technology active, and one tab per tool. Any of four model providers can be chosen in a </w:t>
+      </w:r>
+      <w:r>
+        <w:rPr>
+          <w:rFonts w:ascii="Consolas" w:cs="Consolas" w:eastAsia="Consolas" w:hAnsi="Consolas"/>
+          <w:sz w:val="19"/>
+          <w:szCs w:val="19"/>
+        </w:rPr>
+        <w:t xml:space="preserve">.env</w:t>
+      </w:r>
+      <w:r>
+        <w:t xml:space="preserve"> file; DeepSeek is the default and a full run costs about a cent.</w:t>
       </w:r>
     </w:p>
     <w:p>
@@ -1197,7 +1256,7 @@
                 <w:sz w:val="19"/>
                 <w:szCs w:val="19"/>
               </w:rPr>
-              <w:t xml:space="preserve">Story Intelligence / Evolution Timeline</w:t>
+              <w:t xml:space="preserve">Technology Evolution Timeline</w:t>
             </w:r>
           </w:p>
         </w:tc>
@@ -1249,7 +1308,7 @@
                 <w:sz w:val="19"/>
                 <w:szCs w:val="19"/>
               </w:rPr>
-              <w:t xml:space="preserve">Partial: per-claim label history in the ledger; no clustering or timeline view</w:t>
+              <w:t xml:space="preserve">Built from the ledger, no model calls; stories grouped by developer, no clustering</w:t>
             </w:r>
           </w:p>
         </w:tc>
@@ -1332,7 +1391,7 @@
                 <w:sz w:val="19"/>
                 <w:szCs w:val="19"/>
               </w:rPr>
-              <w:t xml:space="preserve">Not built</w:t>
+              <w:t xml:space="preserve">Built: arXiv link or recommended paper, one model call</w:t>
             </w:r>
           </w:p>
         </w:tc>
@@ -1363,7 +1422,90 @@
                 <w:sz w:val="19"/>
                 <w:szCs w:val="19"/>
               </w:rPr>
-              <w:t xml:space="preserve">Web interface, scheduled runs, email delivery</w:t>
+              <w:t xml:space="preserve">Web interface with “Explain for”</w:t>
+            </w:r>
+          </w:p>
+        </w:tc>
+        <w:tc>
+          <w:tcPr>
+            <w:tcW w:type="dxa" w:w="1500"/>
+            <w:tcBorders>
+              <w:top w:val="single" w:color="BFBFBF" w:sz="4"/>
+              <w:left w:val="single" w:color="BFBFBF" w:sz="4"/>
+              <w:bottom w:val="single" w:color="BFBFBF" w:sz="4"/>
+              <w:right w:val="single" w:color="BFBFBF" w:sz="4"/>
+            </w:tcBorders>
+            <w:tcMar>
+              <w:top w:type="dxa" w:w="60"/>
+              <w:left w:type="dxa" w:w="100"/>
+              <w:bottom w:type="dxa" w:w="60"/>
+              <w:right w:type="dxa" w:w="100"/>
+            </w:tcMar>
+          </w:tcPr>
+          <w:p>
+            <w:r>
+              <w:rPr>
+                <w:sz w:val="19"/>
+                <w:szCs w:val="19"/>
+              </w:rPr>
+              <w:t xml:space="preserve">§5</w:t>
+            </w:r>
+          </w:p>
+        </w:tc>
+        <w:tc>
+          <w:tcPr>
+            <w:tcW w:type="dxa" w:w="4760"/>
+            <w:tcBorders>
+              <w:top w:val="single" w:color="BFBFBF" w:sz="4"/>
+              <w:left w:val="single" w:color="BFBFBF" w:sz="4"/>
+              <w:bottom w:val="single" w:color="BFBFBF" w:sz="4"/>
+              <w:right w:val="single" w:color="BFBFBF" w:sz="4"/>
+            </w:tcBorders>
+            <w:tcMar>
+              <w:top w:type="dxa" w:w="60"/>
+              <w:left w:type="dxa" w:w="100"/>
+              <w:bottom w:type="dxa" w:w="60"/>
+              <w:right w:type="dxa" w:w="100"/>
+            </w:tcMar>
+          </w:tcPr>
+          <w:p>
+            <w:r>
+              <w:rPr>
+                <w:sz w:val="19"/>
+                <w:szCs w:val="19"/>
+              </w:rPr>
+              <w:t xml:space="preserve">Built: local page, one tab per tool</w:t>
+            </w:r>
+          </w:p>
+        </w:tc>
+      </w:tr>
+      <w:tr>
+        <w:trPr>
+          <w:tblHeader w:val="off"/>
+        </w:trPr>
+        <w:tc>
+          <w:tcPr>
+            <w:tcW w:type="dxa" w:w="3100"/>
+            <w:tcBorders>
+              <w:top w:val="single" w:color="BFBFBF" w:sz="4"/>
+              <w:left w:val="single" w:color="BFBFBF" w:sz="4"/>
+              <w:bottom w:val="single" w:color="BFBFBF" w:sz="4"/>
+              <w:right w:val="single" w:color="BFBFBF" w:sz="4"/>
+            </w:tcBorders>
+            <w:tcMar>
+              <w:top w:type="dxa" w:w="60"/>
+              <w:left w:type="dxa" w:w="100"/>
+              <w:bottom w:type="dxa" w:w="60"/>
+              <w:right w:type="dxa" w:w="100"/>
+            </w:tcMar>
+          </w:tcPr>
+          <w:p>
+            <w:r>
+              <w:rPr>
+                <w:sz w:val="19"/>
+                <w:szCs w:val="19"/>
+              </w:rPr>
+              <w:t xml:space="preserve">Scheduled runs, email delivery</w:t>
             </w:r>
           </w:p>
         </w:tc>
@@ -3908,7 +4050,7 @@
                 <w:sz w:val="19"/>
                 <w:szCs w:val="19"/>
               </w:rPr>
-              <w:t xml:space="preserve">arXiv items are marked “preprint, not peer reviewed”.</w:t>
+              <w:t xml:space="preserve">arXiv items are marked “preprint, not peer reviewed”; the Paper Decoder states the review status in its header and reports a claimed publication as the authors’ claim.</w:t>
             </w:r>
           </w:p>
         </w:tc>
@@ -4117,6 +4259,1316 @@
     </w:p>
     <w:p>
       <w:pPr>
+        <w:pStyle w:val="Heading2"/>
+      </w:pPr>
+      <w:r>
+        <w:t xml:space="preserve">3.7 Research Paper Decoder</w:t>
+      </w:r>
+    </w:p>
+    <w:p>
+      <w:pPr>
+        <w:spacing w:after="120"/>
+      </w:pPr>
+      <w:r>
+        <w:t xml:space="preserve">The plan asks the Technology vertical to “explain technical papers through hypothesis, method, findings, limitations, and possible applications” (§3). </w:t>
+      </w:r>
+      <w:r>
+        <w:rPr>
+          <w:rFonts w:ascii="Consolas" w:cs="Consolas" w:eastAsia="Consolas" w:hAnsi="Consolas"/>
+          <w:sz w:val="19"/>
+          <w:szCs w:val="19"/>
+        </w:rPr>
+        <w:t xml:space="preserve">decode &lt;arXiv id or link&gt;</w:t>
+      </w:r>
+      <w:r>
+        <w:t xml:space="preserve"> reads the paper from arXiv only, an approved domain: the API record (title, authors, dates, abstract, journal reference, author comment) and, when arXiv has one, the HTML full text (up to 30,000 characters). One model call writes the five parts for the chosen audience, plus relevance to the reader’s topic and a list of terms.</w:t>
+      </w:r>
+    </w:p>
+    <w:p>
+      <w:pPr>
+        <w:pStyle w:val="ListParagraph"/>
+        <w:numPr>
+          <w:ilvl w:val="0"/>
+          <w:numId w:val="2"/>
+        </w:numPr>
+        <w:spacing w:after="60"/>
+      </w:pPr>
+      <w:r>
+        <w:t xml:space="preserve">Every sentence cites the abstract [1] or the full text [2]; invented citations are stripped, as in briefings.</w:t>
+      </w:r>
+    </w:p>
+    <w:p>
+      <w:pPr>
+        <w:pStyle w:val="ListParagraph"/>
+        <w:numPr>
+          <w:ilvl w:val="0"/>
+          <w:numId w:val="2"/>
+        </w:numPr>
+        <w:spacing w:after="60"/>
+      </w:pPr>
+      <w:r>
+        <w:t xml:space="preserve">Findings are reported as the authors’ claims (“the authors report”), not as established fact.</w:t>
+      </w:r>
+    </w:p>
+    <w:p>
+      <w:pPr>
+        <w:pStyle w:val="ListParagraph"/>
+        <w:numPr>
+          <w:ilvl w:val="0"/>
+          <w:numId w:val="2"/>
+        </w:numPr>
+        <w:spacing w:after="60"/>
+      </w:pPr>
+      <w:r>
+        <w:t xml:space="preserve">Each limitation and application starts with </w:t>
+      </w:r>
+      <w:r>
+        <w:rPr>
+          <w:b/>
+          <w:bCs/>
+        </w:rPr>
+        <w:t xml:space="preserve">(authors)</w:t>
+      </w:r>
+      <w:r>
+        <w:t xml:space="preserve"> or </w:t>
+      </w:r>
+      <w:r>
+        <w:rPr>
+          <w:b/>
+          <w:bCs/>
+        </w:rPr>
+        <w:t xml:space="preserve">(our reading)</w:t>
+      </w:r>
+      <w:r>
+        <w:t xml:space="preserve">, so the agent’s inferences are not passed off as the paper’s. Applications the paper does not test are marked speculative.</w:t>
+      </w:r>
+    </w:p>
+    <w:p>
+      <w:pPr>
+        <w:pStyle w:val="ListParagraph"/>
+        <w:numPr>
+          <w:ilvl w:val="0"/>
+          <w:numId w:val="2"/>
+        </w:numPr>
+        <w:spacing w:after="60"/>
+      </w:pPr>
+      <w:r>
+        <w:t xml:space="preserve">The header states the review status: “preprint, not peer reviewed”, unless the authors list a published version, which is reported as theirs and not checked.</w:t>
+      </w:r>
+    </w:p>
+    <w:p>
+      <w:pPr>
+        <w:pStyle w:val="ListParagraph"/>
+        <w:numPr>
+          <w:ilvl w:val="0"/>
+          <w:numId w:val="2"/>
+        </w:numPr>
+        <w:spacing w:after="60"/>
+      </w:pPr>
+      <w:r>
+        <w:t xml:space="preserve">Papers without an HTML version are decoded from the abstract only, and the output says so.</w:t>
+      </w:r>
+    </w:p>
+    <w:p>
+      <w:pPr>
+        <w:spacing w:after="120"/>
+      </w:pPr>
+      <w:r>
+        <w:t xml:space="preserve">The decoder also recommends papers without calling the model: recent arXiv results for the topic’s saved arXiv queries, plus arXiv papers already cited as evidence for checked claims.</w:t>
+      </w:r>
+    </w:p>
+    <w:p>
+      <w:pPr>
+        <w:pStyle w:val="Heading2"/>
+      </w:pPr>
+      <w:r>
+        <w:t xml:space="preserve">3.8 Technology Evolution Timeline</w:t>
+      </w:r>
+    </w:p>
+    <w:p>
+      <w:pPr>
+        <w:spacing w:after="120"/>
+      </w:pPr>
+      <w:r>
+        <w:t xml:space="preserve">The ledger already records, for each source, who published it, on what basis, and when it was published and retrieved, plus when each claim was first tracked, every label it has had, and each briefing. </w:t>
+      </w:r>
+      <w:r>
+        <w:rPr>
+          <w:rFonts w:ascii="Consolas" w:cs="Consolas" w:eastAsia="Consolas" w:hAnsi="Consolas"/>
+          <w:sz w:val="19"/>
+          <w:szCs w:val="19"/>
+        </w:rPr>
+        <w:t xml:space="preserve">timeline</w:t>
+      </w:r>
+      <w:r>
+        <w:t xml:space="preserve"> only sorts and names these records, so it makes </w:t>
+      </w:r>
+      <w:r>
+        <w:rPr>
+          <w:b/>
+          <w:bCs/>
+        </w:rPr>
+        <w:t xml:space="preserve">no model calls</w:t>
+      </w:r>
+      <w:r>
+        <w:t xml:space="preserve"> and costs nothing. Claims are grouped by the developer of the model they are about.</w:t>
+      </w:r>
+    </w:p>
+    <w:tbl>
+      <w:tblPr>
+        <w:tblW w:type="dxa" w:w="9360"/>
+        <w:tblBorders>
+          <w:top w:val="single" w:color="auto" w:sz="4"/>
+          <w:left w:val="single" w:color="auto" w:sz="4"/>
+          <w:bottom w:val="single" w:color="auto" w:sz="4"/>
+          <w:right w:val="single" w:color="auto" w:sz="4"/>
+          <w:insideH w:val="single" w:color="auto" w:sz="4"/>
+          <w:insideV w:val="single" w:color="auto" w:sz="4"/>
+        </w:tblBorders>
+      </w:tblPr>
+      <w:tblGrid>
+        <w:gridCol w:w="2600"/>
+        <w:gridCol w:w="6760"/>
+      </w:tblGrid>
+      <w:tr>
+        <w:trPr>
+          <w:tblHeader/>
+        </w:trPr>
+        <w:tc>
+          <w:tcPr>
+            <w:tcW w:type="dxa" w:w="2600"/>
+            <w:tcBorders>
+              <w:top w:val="single" w:color="BFBFBF" w:sz="4"/>
+              <w:left w:val="single" w:color="BFBFBF" w:sz="4"/>
+              <w:bottom w:val="single" w:color="BFBFBF" w:sz="4"/>
+              <w:right w:val="single" w:color="BFBFBF" w:sz="4"/>
+            </w:tcBorders>
+            <w:shd w:fill="1F3864" w:color="auto" w:val="clear"/>
+            <w:tcMar>
+              <w:top w:type="dxa" w:w="60"/>
+              <w:left w:type="dxa" w:w="100"/>
+              <w:bottom w:type="dxa" w:w="60"/>
+              <w:right w:type="dxa" w:w="100"/>
+            </w:tcMar>
+          </w:tcPr>
+          <w:p>
+            <w:r>
+              <w:rPr>
+                <w:b/>
+                <w:bCs/>
+                <w:color w:val="FFFFFF"/>
+                <w:sz w:val="19"/>
+                <w:szCs w:val="19"/>
+              </w:rPr>
+              <w:t xml:space="preserve">Event</w:t>
+            </w:r>
+          </w:p>
+        </w:tc>
+        <w:tc>
+          <w:tcPr>
+            <w:tcW w:type="dxa" w:w="6760"/>
+            <w:tcBorders>
+              <w:top w:val="single" w:color="BFBFBF" w:sz="4"/>
+              <w:left w:val="single" w:color="BFBFBF" w:sz="4"/>
+              <w:bottom w:val="single" w:color="BFBFBF" w:sz="4"/>
+              <w:right w:val="single" w:color="BFBFBF" w:sz="4"/>
+            </w:tcBorders>
+            <w:shd w:fill="1F3864" w:color="auto" w:val="clear"/>
+            <w:tcMar>
+              <w:top w:type="dxa" w:w="60"/>
+              <w:left w:type="dxa" w:w="100"/>
+              <w:bottom w:type="dxa" w:w="60"/>
+              <w:right w:type="dxa" w:w="100"/>
+            </w:tcMar>
+          </w:tcPr>
+          <w:p>
+            <w:r>
+              <w:rPr>
+                <w:b/>
+                <w:bCs/>
+                <w:color w:val="FFFFFF"/>
+                <w:sz w:val="19"/>
+                <w:szCs w:val="19"/>
+              </w:rPr>
+              <w:t xml:space="preserve">Taken from</w:t>
+            </w:r>
+          </w:p>
+        </w:tc>
+      </w:tr>
+      <w:tr>
+        <w:trPr>
+          <w:tblHeader w:val="off"/>
+        </w:trPr>
+        <w:tc>
+          <w:tcPr>
+            <w:tcW w:type="dxa" w:w="2600"/>
+            <w:tcBorders>
+              <w:top w:val="single" w:color="BFBFBF" w:sz="4"/>
+              <w:left w:val="single" w:color="BFBFBF" w:sz="4"/>
+              <w:bottom w:val="single" w:color="BFBFBF" w:sz="4"/>
+              <w:right w:val="single" w:color="BFBFBF" w:sz="4"/>
+            </w:tcBorders>
+            <w:tcMar>
+              <w:top w:type="dxa" w:w="60"/>
+              <w:left w:type="dxa" w:w="100"/>
+              <w:bottom w:type="dxa" w:w="60"/>
+              <w:right w:type="dxa" w:w="100"/>
+            </w:tcMar>
+          </w:tcPr>
+          <w:p>
+            <w:r>
+              <w:rPr>
+                <w:sz w:val="19"/>
+                <w:szCs w:val="19"/>
+              </w:rPr>
+              <w:t xml:space="preserve">Developer publication</w:t>
+            </w:r>
+          </w:p>
+        </w:tc>
+        <w:tc>
+          <w:tcPr>
+            <w:tcW w:type="dxa" w:w="6760"/>
+            <w:tcBorders>
+              <w:top w:val="single" w:color="BFBFBF" w:sz="4"/>
+              <w:left w:val="single" w:color="BFBFBF" w:sz="4"/>
+              <w:bottom w:val="single" w:color="BFBFBF" w:sz="4"/>
+              <w:right w:val="single" w:color="BFBFBF" w:sz="4"/>
+            </w:tcBorders>
+            <w:tcMar>
+              <w:top w:type="dxa" w:w="60"/>
+              <w:left w:type="dxa" w:w="100"/>
+              <w:bottom w:type="dxa" w:w="60"/>
+              <w:right w:type="dxa" w:w="100"/>
+            </w:tcMar>
+          </w:tcPr>
+          <w:p>
+            <w:r>
+              <w:rPr>
+                <w:sz w:val="19"/>
+                <w:szCs w:val="19"/>
+              </w:rPr>
+              <w:t xml:space="preserve">A source from the developer (release page, model card, blog). Kept even when not cited for a claim, because it marks the release.</w:t>
+            </w:r>
+          </w:p>
+        </w:tc>
+      </w:tr>
+      <w:tr>
+        <w:trPr>
+          <w:tblHeader w:val="off"/>
+        </w:trPr>
+        <w:tc>
+          <w:tcPr>
+            <w:tcW w:type="dxa" w:w="2600"/>
+            <w:tcBorders>
+              <w:top w:val="single" w:color="BFBFBF" w:sz="4"/>
+              <w:left w:val="single" w:color="BFBFBF" w:sz="4"/>
+              <w:bottom w:val="single" w:color="BFBFBF" w:sz="4"/>
+              <w:right w:val="single" w:color="BFBFBF" w:sz="4"/>
+            </w:tcBorders>
+            <w:tcMar>
+              <w:top w:type="dxa" w:w="60"/>
+              <w:left w:type="dxa" w:w="100"/>
+              <w:bottom w:type="dxa" w:w="60"/>
+              <w:right w:type="dxa" w:w="100"/>
+            </w:tcMar>
+          </w:tcPr>
+          <w:p>
+            <w:r>
+              <w:rPr>
+                <w:sz w:val="19"/>
+                <w:szCs w:val="19"/>
+              </w:rPr>
+              <w:t xml:space="preserve">Repeats the developer</w:t>
+            </w:r>
+          </w:p>
+        </w:tc>
+        <w:tc>
+          <w:tcPr>
+            <w:tcW w:type="dxa" w:w="6760"/>
+            <w:tcBorders>
+              <w:top w:val="single" w:color="BFBFBF" w:sz="4"/>
+              <w:left w:val="single" w:color="BFBFBF" w:sz="4"/>
+              <w:bottom w:val="single" w:color="BFBFBF" w:sz="4"/>
+              <w:right w:val="single" w:color="BFBFBF" w:sz="4"/>
+            </w:tcBorders>
+            <w:tcMar>
+              <w:top w:type="dxa" w:w="60"/>
+              <w:left w:type="dxa" w:w="100"/>
+              <w:bottom w:type="dxa" w:w="60"/>
+              <w:right w:type="dxa" w:w="100"/>
+            </w:tcMar>
+          </w:tcPr>
+          <w:p>
+            <w:r>
+              <w:rPr>
+                <w:sz w:val="19"/>
+                <w:szCs w:val="19"/>
+              </w:rPr>
+              <w:t xml:space="preserve">Another party relaying the developer’s own numbers.</w:t>
+            </w:r>
+          </w:p>
+        </w:tc>
+      </w:tr>
+      <w:tr>
+        <w:trPr>
+          <w:tblHeader w:val="off"/>
+        </w:trPr>
+        <w:tc>
+          <w:tcPr>
+            <w:tcW w:type="dxa" w:w="2600"/>
+            <w:tcBorders>
+              <w:top w:val="single" w:color="BFBFBF" w:sz="4"/>
+              <w:left w:val="single" w:color="BFBFBF" w:sz="4"/>
+              <w:bottom w:val="single" w:color="BFBFBF" w:sz="4"/>
+              <w:right w:val="single" w:color="BFBFBF" w:sz="4"/>
+            </w:tcBorders>
+            <w:tcMar>
+              <w:top w:type="dxa" w:w="60"/>
+              <w:left w:type="dxa" w:w="100"/>
+              <w:bottom w:type="dxa" w:w="60"/>
+              <w:right w:type="dxa" w:w="100"/>
+            </w:tcMar>
+          </w:tcPr>
+          <w:p>
+            <w:r>
+              <w:rPr>
+                <w:sz w:val="19"/>
+                <w:szCs w:val="19"/>
+              </w:rPr>
+              <w:t xml:space="preserve">Independent evaluation</w:t>
+            </w:r>
+          </w:p>
+        </w:tc>
+        <w:tc>
+          <w:tcPr>
+            <w:tcW w:type="dxa" w:w="6760"/>
+            <w:tcBorders>
+              <w:top w:val="single" w:color="BFBFBF" w:sz="4"/>
+              <w:left w:val="single" w:color="BFBFBF" w:sz="4"/>
+              <w:bottom w:val="single" w:color="BFBFBF" w:sz="4"/>
+              <w:right w:val="single" w:color="BFBFBF" w:sz="4"/>
+            </w:tcBorders>
+            <w:tcMar>
+              <w:top w:type="dxa" w:w="60"/>
+              <w:left w:type="dxa" w:w="100"/>
+              <w:bottom w:type="dxa" w:w="60"/>
+              <w:right w:type="dxa" w:w="100"/>
+            </w:tcMar>
+          </w:tcPr>
+          <w:p>
+            <w:r>
+              <w:rPr>
+                <w:sz w:val="19"/>
+                <w:szCs w:val="19"/>
+              </w:rPr>
+              <w:t xml:space="preserve">A party other than the developer reporting its own testing.</w:t>
+            </w:r>
+          </w:p>
+        </w:tc>
+      </w:tr>
+      <w:tr>
+        <w:trPr>
+          <w:tblHeader w:val="off"/>
+        </w:trPr>
+        <w:tc>
+          <w:tcPr>
+            <w:tcW w:type="dxa" w:w="2600"/>
+            <w:tcBorders>
+              <w:top w:val="single" w:color="BFBFBF" w:sz="4"/>
+              <w:left w:val="single" w:color="BFBFBF" w:sz="4"/>
+              <w:bottom w:val="single" w:color="BFBFBF" w:sz="4"/>
+              <w:right w:val="single" w:color="BFBFBF" w:sz="4"/>
+            </w:tcBorders>
+            <w:tcMar>
+              <w:top w:type="dxa" w:w="60"/>
+              <w:left w:type="dxa" w:w="100"/>
+              <w:bottom w:type="dxa" w:w="60"/>
+              <w:right w:type="dxa" w:w="100"/>
+            </w:tcMar>
+          </w:tcPr>
+          <w:p>
+            <w:r>
+              <w:rPr>
+                <w:sz w:val="19"/>
+                <w:szCs w:val="19"/>
+              </w:rPr>
+              <w:t xml:space="preserve">Evidence label</w:t>
+            </w:r>
+          </w:p>
+        </w:tc>
+        <w:tc>
+          <w:tcPr>
+            <w:tcW w:type="dxa" w:w="6760"/>
+            <w:tcBorders>
+              <w:top w:val="single" w:color="BFBFBF" w:sz="4"/>
+              <w:left w:val="single" w:color="BFBFBF" w:sz="4"/>
+              <w:bottom w:val="single" w:color="BFBFBF" w:sz="4"/>
+              <w:right w:val="single" w:color="BFBFBF" w:sz="4"/>
+            </w:tcBorders>
+            <w:tcMar>
+              <w:top w:type="dxa" w:w="60"/>
+              <w:left w:type="dxa" w:w="100"/>
+              <w:bottom w:type="dxa" w:w="60"/>
+              <w:right w:type="dxa" w:w="100"/>
+            </w:tcMar>
+          </w:tcPr>
+          <w:p>
+            <w:r>
+              <w:rPr>
+                <w:sz w:val="19"/>
+                <w:szCs w:val="19"/>
+              </w:rPr>
+              <w:t xml:space="preserve">The claim being tracked, and every change of label.</w:t>
+            </w:r>
+          </w:p>
+        </w:tc>
+      </w:tr>
+      <w:tr>
+        <w:trPr>
+          <w:tblHeader w:val="off"/>
+        </w:trPr>
+        <w:tc>
+          <w:tcPr>
+            <w:tcW w:type="dxa" w:w="2600"/>
+            <w:tcBorders>
+              <w:top w:val="single" w:color="BFBFBF" w:sz="4"/>
+              <w:left w:val="single" w:color="BFBFBF" w:sz="4"/>
+              <w:bottom w:val="single" w:color="BFBFBF" w:sz="4"/>
+              <w:right w:val="single" w:color="BFBFBF" w:sz="4"/>
+            </w:tcBorders>
+            <w:tcMar>
+              <w:top w:type="dxa" w:w="60"/>
+              <w:left w:type="dxa" w:w="100"/>
+              <w:bottom w:type="dxa" w:w="60"/>
+              <w:right w:type="dxa" w:w="100"/>
+            </w:tcMar>
+          </w:tcPr>
+          <w:p>
+            <w:r>
+              <w:rPr>
+                <w:sz w:val="19"/>
+                <w:szCs w:val="19"/>
+              </w:rPr>
+              <w:t xml:space="preserve">Editorial</w:t>
+            </w:r>
+          </w:p>
+        </w:tc>
+        <w:tc>
+          <w:tcPr>
+            <w:tcW w:type="dxa" w:w="6760"/>
+            <w:tcBorders>
+              <w:top w:val="single" w:color="BFBFBF" w:sz="4"/>
+              <w:left w:val="single" w:color="BFBFBF" w:sz="4"/>
+              <w:bottom w:val="single" w:color="BFBFBF" w:sz="4"/>
+              <w:right w:val="single" w:color="BFBFBF" w:sz="4"/>
+            </w:tcBorders>
+            <w:tcMar>
+              <w:top w:type="dxa" w:w="60"/>
+              <w:left w:type="dxa" w:w="100"/>
+              <w:bottom w:type="dxa" w:w="60"/>
+              <w:right w:type="dxa" w:w="100"/>
+            </w:tcMar>
+          </w:tcPr>
+          <w:p>
+            <w:r>
+              <w:rPr>
+                <w:sz w:val="19"/>
+                <w:szCs w:val="19"/>
+              </w:rPr>
+              <w:t xml:space="preserve">Briefing drafted, approved and delivered.</w:t>
+            </w:r>
+          </w:p>
+        </w:tc>
+      </w:tr>
+    </w:tbl>
+    <w:p>
+      <w:pPr>
+        <w:spacing w:after="200" w:before="60"/>
+      </w:pPr>
+      <w:r>
+        <w:rPr>
+          <w:i/>
+          <w:iCs/>
+          <w:color w:val="555555"/>
+          <w:sz w:val="18"/>
+          <w:szCs w:val="18"/>
+        </w:rPr>
+        <w:t xml:space="preserve">Table 8. Timeline events. Each node keeps its source link.</w:t>
+      </w:r>
+    </w:p>
+    <w:p>
+      <w:pPr>
+        <w:spacing w:after="120"/>
+      </w:pPr>
+      <w:r>
+        <w:t xml:space="preserve">Each story gets one summary line: the days from the developer’s first source to the first independent result. That delay is what a Launch Reality Check reader wants to know. Dates are publication times where the source gives one, otherwise retrieval times, and are marked as such.</w:t>
+      </w:r>
+    </w:p>
+    <w:p>
+      <w:pPr>
+        <w:pStyle w:val="Heading2"/>
+      </w:pPr>
+      <w:r>
+        <w:t xml:space="preserve">3.9 Web page, model providers and the setup check</w:t>
+      </w:r>
+    </w:p>
+    <w:p>
+      <w:pPr>
+        <w:spacing w:after="120"/>
+      </w:pPr>
+      <w:r>
+        <w:rPr>
+          <w:rFonts w:ascii="Consolas" w:cs="Consolas" w:eastAsia="Consolas" w:hAnsi="Consolas"/>
+          <w:sz w:val="19"/>
+          <w:szCs w:val="19"/>
+        </w:rPr>
+        <w:t xml:space="preserve">serve</w:t>
+      </w:r>
+      <w:r>
+        <w:t xml:space="preserve"> starts a local page (listening on 127.0.0.1 only, standard library only). The top bar shows the plan’s four verticals; Education, Industry and Finance are greyed out. Technology has one tab per tool, and each tab opens with three short boxes taken from this report: what the tool does, how it works, and its real result. Its buttons run the same code as the command line.</w:t>
+      </w:r>
+    </w:p>
+    <w:tbl>
+      <w:tblPr>
+        <w:tblW w:type="dxa" w:w="9360"/>
+        <w:tblBorders>
+          <w:top w:val="single" w:color="auto" w:sz="4"/>
+          <w:left w:val="single" w:color="auto" w:sz="4"/>
+          <w:bottom w:val="single" w:color="auto" w:sz="4"/>
+          <w:right w:val="single" w:color="auto" w:sz="4"/>
+          <w:insideH w:val="single" w:color="auto" w:sz="4"/>
+          <w:insideV w:val="single" w:color="auto" w:sz="4"/>
+        </w:tblBorders>
+      </w:tblPr>
+      <w:tblGrid>
+        <w:gridCol w:w="2300"/>
+        <w:gridCol w:w="4860"/>
+        <w:gridCol w:w="2200"/>
+      </w:tblGrid>
+      <w:tr>
+        <w:trPr>
+          <w:tblHeader/>
+        </w:trPr>
+        <w:tc>
+          <w:tcPr>
+            <w:tcW w:type="dxa" w:w="2300"/>
+            <w:tcBorders>
+              <w:top w:val="single" w:color="BFBFBF" w:sz="4"/>
+              <w:left w:val="single" w:color="BFBFBF" w:sz="4"/>
+              <w:bottom w:val="single" w:color="BFBFBF" w:sz="4"/>
+              <w:right w:val="single" w:color="BFBFBF" w:sz="4"/>
+            </w:tcBorders>
+            <w:shd w:fill="1F3864" w:color="auto" w:val="clear"/>
+            <w:tcMar>
+              <w:top w:type="dxa" w:w="60"/>
+              <w:left w:type="dxa" w:w="100"/>
+              <w:bottom w:type="dxa" w:w="60"/>
+              <w:right w:type="dxa" w:w="100"/>
+            </w:tcMar>
+          </w:tcPr>
+          <w:p>
+            <w:r>
+              <w:rPr>
+                <w:b/>
+                <w:bCs/>
+                <w:color w:val="FFFFFF"/>
+                <w:sz w:val="19"/>
+                <w:szCs w:val="19"/>
+              </w:rPr>
+              <w:t xml:space="preserve">Tab</w:t>
+            </w:r>
+          </w:p>
+        </w:tc>
+        <w:tc>
+          <w:tcPr>
+            <w:tcW w:type="dxa" w:w="4860"/>
+            <w:tcBorders>
+              <w:top w:val="single" w:color="BFBFBF" w:sz="4"/>
+              <w:left w:val="single" w:color="BFBFBF" w:sz="4"/>
+              <w:bottom w:val="single" w:color="BFBFBF" w:sz="4"/>
+              <w:right w:val="single" w:color="BFBFBF" w:sz="4"/>
+            </w:tcBorders>
+            <w:shd w:fill="1F3864" w:color="auto" w:val="clear"/>
+            <w:tcMar>
+              <w:top w:type="dxa" w:w="60"/>
+              <w:left w:type="dxa" w:w="100"/>
+              <w:bottom w:type="dxa" w:w="60"/>
+              <w:right w:type="dxa" w:w="100"/>
+            </w:tcMar>
+          </w:tcPr>
+          <w:p>
+            <w:r>
+              <w:rPr>
+                <w:b/>
+                <w:bCs/>
+                <w:color w:val="FFFFFF"/>
+                <w:sz w:val="19"/>
+                <w:szCs w:val="19"/>
+              </w:rPr>
+              <w:t xml:space="preserve">What the reader or editor can do</w:t>
+            </w:r>
+          </w:p>
+        </w:tc>
+        <w:tc>
+          <w:tcPr>
+            <w:tcW w:type="dxa" w:w="2200"/>
+            <w:tcBorders>
+              <w:top w:val="single" w:color="BFBFBF" w:sz="4"/>
+              <w:left w:val="single" w:color="BFBFBF" w:sz="4"/>
+              <w:bottom w:val="single" w:color="BFBFBF" w:sz="4"/>
+              <w:right w:val="single" w:color="BFBFBF" w:sz="4"/>
+            </w:tcBorders>
+            <w:shd w:fill="1F3864" w:color="auto" w:val="clear"/>
+            <w:tcMar>
+              <w:top w:type="dxa" w:w="60"/>
+              <w:left w:type="dxa" w:w="100"/>
+              <w:bottom w:type="dxa" w:w="60"/>
+              <w:right w:type="dxa" w:w="100"/>
+            </w:tcMar>
+          </w:tcPr>
+          <w:p>
+            <w:r>
+              <w:rPr>
+                <w:b/>
+                <w:bCs/>
+                <w:color w:val="FFFFFF"/>
+                <w:sz w:val="19"/>
+                <w:szCs w:val="19"/>
+              </w:rPr>
+              <w:t xml:space="preserve">Model calls</w:t>
+            </w:r>
+          </w:p>
+        </w:tc>
+      </w:tr>
+      <w:tr>
+        <w:trPr>
+          <w:tblHeader w:val="off"/>
+        </w:trPr>
+        <w:tc>
+          <w:tcPr>
+            <w:tcW w:type="dxa" w:w="2300"/>
+            <w:tcBorders>
+              <w:top w:val="single" w:color="BFBFBF" w:sz="4"/>
+              <w:left w:val="single" w:color="BFBFBF" w:sz="4"/>
+              <w:bottom w:val="single" w:color="BFBFBF" w:sz="4"/>
+              <w:right w:val="single" w:color="BFBFBF" w:sz="4"/>
+            </w:tcBorders>
+            <w:tcMar>
+              <w:top w:type="dxa" w:w="60"/>
+              <w:left w:type="dxa" w:w="100"/>
+              <w:bottom w:type="dxa" w:w="60"/>
+              <w:right w:type="dxa" w:w="100"/>
+            </w:tcMar>
+          </w:tcPr>
+          <w:p>
+            <w:r>
+              <w:rPr>
+                <w:sz w:val="19"/>
+                <w:szCs w:val="19"/>
+              </w:rPr>
+              <w:t xml:space="preserve">Overview</w:t>
+            </w:r>
+          </w:p>
+        </w:tc>
+        <w:tc>
+          <w:tcPr>
+            <w:tcW w:type="dxa" w:w="4860"/>
+            <w:tcBorders>
+              <w:top w:val="single" w:color="BFBFBF" w:sz="4"/>
+              <w:left w:val="single" w:color="BFBFBF" w:sz="4"/>
+              <w:bottom w:val="single" w:color="BFBFBF" w:sz="4"/>
+              <w:right w:val="single" w:color="BFBFBF" w:sz="4"/>
+            </w:tcBorders>
+            <w:tcMar>
+              <w:top w:type="dxa" w:w="60"/>
+              <w:left w:type="dxa" w:w="100"/>
+              <w:bottom w:type="dxa" w:w="60"/>
+              <w:right w:type="dxa" w:w="100"/>
+            </w:tcMar>
+          </w:tcPr>
+          <w:p>
+            <w:r>
+              <w:rPr>
+                <w:sz w:val="19"/>
+                <w:szCs w:val="19"/>
+              </w:rPr>
+              <w:t xml:space="preserve">Design rule, coverage of the plan, success metrics, limitations</w:t>
+            </w:r>
+          </w:p>
+        </w:tc>
+        <w:tc>
+          <w:tcPr>
+            <w:tcW w:type="dxa" w:w="2200"/>
+            <w:tcBorders>
+              <w:top w:val="single" w:color="BFBFBF" w:sz="4"/>
+              <w:left w:val="single" w:color="BFBFBF" w:sz="4"/>
+              <w:bottom w:val="single" w:color="BFBFBF" w:sz="4"/>
+              <w:right w:val="single" w:color="BFBFBF" w:sz="4"/>
+            </w:tcBorders>
+            <w:tcMar>
+              <w:top w:type="dxa" w:w="60"/>
+              <w:left w:type="dxa" w:w="100"/>
+              <w:bottom w:type="dxa" w:w="60"/>
+              <w:right w:type="dxa" w:w="100"/>
+            </w:tcMar>
+          </w:tcPr>
+          <w:p>
+            <w:r>
+              <w:rPr>
+                <w:sz w:val="19"/>
+                <w:szCs w:val="19"/>
+              </w:rPr>
+              <w:t xml:space="preserve">0</w:t>
+            </w:r>
+          </w:p>
+        </w:tc>
+      </w:tr>
+      <w:tr>
+        <w:trPr>
+          <w:tblHeader w:val="off"/>
+        </w:trPr>
+        <w:tc>
+          <w:tcPr>
+            <w:tcW w:type="dxa" w:w="2300"/>
+            <w:tcBorders>
+              <w:top w:val="single" w:color="BFBFBF" w:sz="4"/>
+              <w:left w:val="single" w:color="BFBFBF" w:sz="4"/>
+              <w:bottom w:val="single" w:color="BFBFBF" w:sz="4"/>
+              <w:right w:val="single" w:color="BFBFBF" w:sz="4"/>
+            </w:tcBorders>
+            <w:tcMar>
+              <w:top w:type="dxa" w:w="60"/>
+              <w:left w:type="dxa" w:w="100"/>
+              <w:bottom w:type="dxa" w:w="60"/>
+              <w:right w:type="dxa" w:w="100"/>
+            </w:tcMar>
+          </w:tcPr>
+          <w:p>
+            <w:r>
+              <w:rPr>
+                <w:sz w:val="19"/>
+                <w:szCs w:val="19"/>
+              </w:rPr>
+              <w:t xml:space="preserve">Follow a Topic</w:t>
+            </w:r>
+          </w:p>
+        </w:tc>
+        <w:tc>
+          <w:tcPr>
+            <w:tcW w:type="dxa" w:w="4860"/>
+            <w:tcBorders>
+              <w:top w:val="single" w:color="BFBFBF" w:sz="4"/>
+              <w:left w:val="single" w:color="BFBFBF" w:sz="4"/>
+              <w:bottom w:val="single" w:color="BFBFBF" w:sz="4"/>
+              <w:right w:val="single" w:color="BFBFBF" w:sz="4"/>
+            </w:tcBorders>
+            <w:tcMar>
+              <w:top w:type="dxa" w:w="60"/>
+              <w:left w:type="dxa" w:w="100"/>
+              <w:bottom w:type="dxa" w:w="60"/>
+              <w:right w:type="dxa" w:w="100"/>
+            </w:tcMar>
+          </w:tcPr>
+          <w:p>
+            <w:r>
+              <w:rPr>
+                <w:sz w:val="19"/>
+                <w:szCs w:val="19"/>
+              </w:rPr>
+              <w:t xml:space="preserve">See the saved question, press Run now, open briefings, approve as editor</w:t>
+            </w:r>
+          </w:p>
+        </w:tc>
+        <w:tc>
+          <w:tcPr>
+            <w:tcW w:type="dxa" w:w="2200"/>
+            <w:tcBorders>
+              <w:top w:val="single" w:color="BFBFBF" w:sz="4"/>
+              <w:left w:val="single" w:color="BFBFBF" w:sz="4"/>
+              <w:bottom w:val="single" w:color="BFBFBF" w:sz="4"/>
+              <w:right w:val="single" w:color="BFBFBF" w:sz="4"/>
+            </w:tcBorders>
+            <w:tcMar>
+              <w:top w:type="dxa" w:w="60"/>
+              <w:left w:type="dxa" w:w="100"/>
+              <w:bottom w:type="dxa" w:w="60"/>
+              <w:right w:type="dxa" w:w="100"/>
+            </w:tcMar>
+          </w:tcPr>
+          <w:p>
+            <w:r>
+              <w:rPr>
+                <w:sz w:val="19"/>
+                <w:szCs w:val="19"/>
+              </w:rPr>
+              <w:t xml:space="preserve">Run: about 8</w:t>
+            </w:r>
+          </w:p>
+        </w:tc>
+      </w:tr>
+      <w:tr>
+        <w:trPr>
+          <w:tblHeader w:val="off"/>
+        </w:trPr>
+        <w:tc>
+          <w:tcPr>
+            <w:tcW w:type="dxa" w:w="2300"/>
+            <w:tcBorders>
+              <w:top w:val="single" w:color="BFBFBF" w:sz="4"/>
+              <w:left w:val="single" w:color="BFBFBF" w:sz="4"/>
+              <w:bottom w:val="single" w:color="BFBFBF" w:sz="4"/>
+              <w:right w:val="single" w:color="BFBFBF" w:sz="4"/>
+            </w:tcBorders>
+            <w:tcMar>
+              <w:top w:type="dxa" w:w="60"/>
+              <w:left w:type="dxa" w:w="100"/>
+              <w:bottom w:type="dxa" w:w="60"/>
+              <w:right w:type="dxa" w:w="100"/>
+            </w:tcMar>
+          </w:tcPr>
+          <w:p>
+            <w:r>
+              <w:rPr>
+                <w:sz w:val="19"/>
+                <w:szCs w:val="19"/>
+              </w:rPr>
+              <w:t xml:space="preserve">Launch Reality Check</w:t>
+            </w:r>
+          </w:p>
+        </w:tc>
+        <w:tc>
+          <w:tcPr>
+            <w:tcW w:type="dxa" w:w="4860"/>
+            <w:tcBorders>
+              <w:top w:val="single" w:color="BFBFBF" w:sz="4"/>
+              <w:left w:val="single" w:color="BFBFBF" w:sz="4"/>
+              <w:bottom w:val="single" w:color="BFBFBF" w:sz="4"/>
+              <w:right w:val="single" w:color="BFBFBF" w:sz="4"/>
+            </w:tcBorders>
+            <w:tcMar>
+              <w:top w:type="dxa" w:w="60"/>
+              <w:left w:type="dxa" w:w="100"/>
+              <w:bottom w:type="dxa" w:w="60"/>
+              <w:right w:type="dxa" w:w="100"/>
+            </w:tcMar>
+          </w:tcPr>
+          <w:p>
+            <w:r>
+              <w:rPr>
+                <w:sz w:val="19"/>
+                <w:szCs w:val="19"/>
+              </w:rPr>
+              <w:t xml:space="preserve">Every claim with its label, sources, basis, quotes and the verifier’s note</w:t>
+            </w:r>
+          </w:p>
+        </w:tc>
+        <w:tc>
+          <w:tcPr>
+            <w:tcW w:type="dxa" w:w="2200"/>
+            <w:tcBorders>
+              <w:top w:val="single" w:color="BFBFBF" w:sz="4"/>
+              <w:left w:val="single" w:color="BFBFBF" w:sz="4"/>
+              <w:bottom w:val="single" w:color="BFBFBF" w:sz="4"/>
+              <w:right w:val="single" w:color="BFBFBF" w:sz="4"/>
+            </w:tcBorders>
+            <w:tcMar>
+              <w:top w:type="dxa" w:w="60"/>
+              <w:left w:type="dxa" w:w="100"/>
+              <w:bottom w:type="dxa" w:w="60"/>
+              <w:right w:type="dxa" w:w="100"/>
+            </w:tcMar>
+          </w:tcPr>
+          <w:p>
+            <w:r>
+              <w:rPr>
+                <w:sz w:val="19"/>
+                <w:szCs w:val="19"/>
+              </w:rPr>
+              <w:t xml:space="preserve">0</w:t>
+            </w:r>
+          </w:p>
+        </w:tc>
+      </w:tr>
+      <w:tr>
+        <w:trPr>
+          <w:tblHeader w:val="off"/>
+        </w:trPr>
+        <w:tc>
+          <w:tcPr>
+            <w:tcW w:type="dxa" w:w="2300"/>
+            <w:tcBorders>
+              <w:top w:val="single" w:color="BFBFBF" w:sz="4"/>
+              <w:left w:val="single" w:color="BFBFBF" w:sz="4"/>
+              <w:bottom w:val="single" w:color="BFBFBF" w:sz="4"/>
+              <w:right w:val="single" w:color="BFBFBF" w:sz="4"/>
+            </w:tcBorders>
+            <w:tcMar>
+              <w:top w:type="dxa" w:w="60"/>
+              <w:left w:type="dxa" w:w="100"/>
+              <w:bottom w:type="dxa" w:w="60"/>
+              <w:right w:type="dxa" w:w="100"/>
+            </w:tcMar>
+          </w:tcPr>
+          <w:p>
+            <w:r>
+              <w:rPr>
+                <w:sz w:val="19"/>
+                <w:szCs w:val="19"/>
+              </w:rPr>
+              <w:t xml:space="preserve">Ask Newsren</w:t>
+            </w:r>
+          </w:p>
+        </w:tc>
+        <w:tc>
+          <w:tcPr>
+            <w:tcW w:type="dxa" w:w="4860"/>
+            <w:tcBorders>
+              <w:top w:val="single" w:color="BFBFBF" w:sz="4"/>
+              <w:left w:val="single" w:color="BFBFBF" w:sz="4"/>
+              <w:bottom w:val="single" w:color="BFBFBF" w:sz="4"/>
+              <w:right w:val="single" w:color="BFBFBF" w:sz="4"/>
+            </w:tcBorders>
+            <w:tcMar>
+              <w:top w:type="dxa" w:w="60"/>
+              <w:left w:type="dxa" w:w="100"/>
+              <w:bottom w:type="dxa" w:w="60"/>
+              <w:right w:type="dxa" w:w="100"/>
+            </w:tcMar>
+          </w:tcPr>
+          <w:p>
+            <w:r>
+              <w:rPr>
+                <w:sz w:val="19"/>
+                <w:szCs w:val="19"/>
+              </w:rPr>
+              <w:t xml:space="preserve">Ask a question and read answers</w:t>
+            </w:r>
+          </w:p>
+        </w:tc>
+        <w:tc>
+          <w:tcPr>
+            <w:tcW w:type="dxa" w:w="2200"/>
+            <w:tcBorders>
+              <w:top w:val="single" w:color="BFBFBF" w:sz="4"/>
+              <w:left w:val="single" w:color="BFBFBF" w:sz="4"/>
+              <w:bottom w:val="single" w:color="BFBFBF" w:sz="4"/>
+              <w:right w:val="single" w:color="BFBFBF" w:sz="4"/>
+            </w:tcBorders>
+            <w:tcMar>
+              <w:top w:type="dxa" w:w="60"/>
+              <w:left w:type="dxa" w:w="100"/>
+              <w:bottom w:type="dxa" w:w="60"/>
+              <w:right w:type="dxa" w:w="100"/>
+            </w:tcMar>
+          </w:tcPr>
+          <w:p>
+            <w:r>
+              <w:rPr>
+                <w:sz w:val="19"/>
+                <w:szCs w:val="19"/>
+              </w:rPr>
+              <w:t xml:space="preserve">2</w:t>
+            </w:r>
+          </w:p>
+        </w:tc>
+      </w:tr>
+      <w:tr>
+        <w:trPr>
+          <w:tblHeader w:val="off"/>
+        </w:trPr>
+        <w:tc>
+          <w:tcPr>
+            <w:tcW w:type="dxa" w:w="2300"/>
+            <w:tcBorders>
+              <w:top w:val="single" w:color="BFBFBF" w:sz="4"/>
+              <w:left w:val="single" w:color="BFBFBF" w:sz="4"/>
+              <w:bottom w:val="single" w:color="BFBFBF" w:sz="4"/>
+              <w:right w:val="single" w:color="BFBFBF" w:sz="4"/>
+            </w:tcBorders>
+            <w:tcMar>
+              <w:top w:type="dxa" w:w="60"/>
+              <w:left w:type="dxa" w:w="100"/>
+              <w:bottom w:type="dxa" w:w="60"/>
+              <w:right w:type="dxa" w:w="100"/>
+            </w:tcMar>
+          </w:tcPr>
+          <w:p>
+            <w:r>
+              <w:rPr>
+                <w:sz w:val="19"/>
+                <w:szCs w:val="19"/>
+              </w:rPr>
+              <w:t xml:space="preserve">Learn</w:t>
+            </w:r>
+          </w:p>
+        </w:tc>
+        <w:tc>
+          <w:tcPr>
+            <w:tcW w:type="dxa" w:w="4860"/>
+            <w:tcBorders>
+              <w:top w:val="single" w:color="BFBFBF" w:sz="4"/>
+              <w:left w:val="single" w:color="BFBFBF" w:sz="4"/>
+              <w:bottom w:val="single" w:color="BFBFBF" w:sz="4"/>
+              <w:right w:val="single" w:color="BFBFBF" w:sz="4"/>
+            </w:tcBorders>
+            <w:tcMar>
+              <w:top w:type="dxa" w:w="60"/>
+              <w:left w:type="dxa" w:w="100"/>
+              <w:bottom w:type="dxa" w:w="60"/>
+              <w:right w:type="dxa" w:w="100"/>
+            </w:tcMar>
+          </w:tcPr>
+          <w:p>
+            <w:r>
+              <w:rPr>
+                <w:sz w:val="19"/>
+                <w:szCs w:val="19"/>
+              </w:rPr>
+              <w:t xml:space="preserve">Explain for student, educator or professional from a briefing</w:t>
+            </w:r>
+          </w:p>
+        </w:tc>
+        <w:tc>
+          <w:tcPr>
+            <w:tcW w:type="dxa" w:w="2200"/>
+            <w:tcBorders>
+              <w:top w:val="single" w:color="BFBFBF" w:sz="4"/>
+              <w:left w:val="single" w:color="BFBFBF" w:sz="4"/>
+              <w:bottom w:val="single" w:color="BFBFBF" w:sz="4"/>
+              <w:right w:val="single" w:color="BFBFBF" w:sz="4"/>
+            </w:tcBorders>
+            <w:tcMar>
+              <w:top w:type="dxa" w:w="60"/>
+              <w:left w:type="dxa" w:w="100"/>
+              <w:bottom w:type="dxa" w:w="60"/>
+              <w:right w:type="dxa" w:w="100"/>
+            </w:tcMar>
+          </w:tcPr>
+          <w:p>
+            <w:r>
+              <w:rPr>
+                <w:sz w:val="19"/>
+                <w:szCs w:val="19"/>
+              </w:rPr>
+              <w:t xml:space="preserve">1 per level</w:t>
+            </w:r>
+          </w:p>
+        </w:tc>
+      </w:tr>
+      <w:tr>
+        <w:trPr>
+          <w:tblHeader w:val="off"/>
+        </w:trPr>
+        <w:tc>
+          <w:tcPr>
+            <w:tcW w:type="dxa" w:w="2300"/>
+            <w:tcBorders>
+              <w:top w:val="single" w:color="BFBFBF" w:sz="4"/>
+              <w:left w:val="single" w:color="BFBFBF" w:sz="4"/>
+              <w:bottom w:val="single" w:color="BFBFBF" w:sz="4"/>
+              <w:right w:val="single" w:color="BFBFBF" w:sz="4"/>
+            </w:tcBorders>
+            <w:tcMar>
+              <w:top w:type="dxa" w:w="60"/>
+              <w:left w:type="dxa" w:w="100"/>
+              <w:bottom w:type="dxa" w:w="60"/>
+              <w:right w:type="dxa" w:w="100"/>
+            </w:tcMar>
+          </w:tcPr>
+          <w:p>
+            <w:r>
+              <w:rPr>
+                <w:sz w:val="19"/>
+                <w:szCs w:val="19"/>
+              </w:rPr>
+              <w:t xml:space="preserve">Paper Decoder</w:t>
+            </w:r>
+          </w:p>
+        </w:tc>
+        <w:tc>
+          <w:tcPr>
+            <w:tcW w:type="dxa" w:w="4860"/>
+            <w:tcBorders>
+              <w:top w:val="single" w:color="BFBFBF" w:sz="4"/>
+              <w:left w:val="single" w:color="BFBFBF" w:sz="4"/>
+              <w:bottom w:val="single" w:color="BFBFBF" w:sz="4"/>
+              <w:right w:val="single" w:color="BFBFBF" w:sz="4"/>
+            </w:tcBorders>
+            <w:tcMar>
+              <w:top w:type="dxa" w:w="60"/>
+              <w:left w:type="dxa" w:w="100"/>
+              <w:bottom w:type="dxa" w:w="60"/>
+              <w:right w:type="dxa" w:w="100"/>
+            </w:tcMar>
+          </w:tcPr>
+          <w:p>
+            <w:r>
+              <w:rPr>
+                <w:sz w:val="19"/>
+                <w:szCs w:val="19"/>
+              </w:rPr>
+              <w:t xml:space="preserve">Paste an arXiv link, or decode a recommended paper</w:t>
+            </w:r>
+          </w:p>
+        </w:tc>
+        <w:tc>
+          <w:tcPr>
+            <w:tcW w:type="dxa" w:w="2200"/>
+            <w:tcBorders>
+              <w:top w:val="single" w:color="BFBFBF" w:sz="4"/>
+              <w:left w:val="single" w:color="BFBFBF" w:sz="4"/>
+              <w:bottom w:val="single" w:color="BFBFBF" w:sz="4"/>
+              <w:right w:val="single" w:color="BFBFBF" w:sz="4"/>
+            </w:tcBorders>
+            <w:tcMar>
+              <w:top w:type="dxa" w:w="60"/>
+              <w:left w:type="dxa" w:w="100"/>
+              <w:bottom w:type="dxa" w:w="60"/>
+              <w:right w:type="dxa" w:w="100"/>
+            </w:tcMar>
+          </w:tcPr>
+          <w:p>
+            <w:r>
+              <w:rPr>
+                <w:sz w:val="19"/>
+                <w:szCs w:val="19"/>
+              </w:rPr>
+              <w:t xml:space="preserve">1</w:t>
+            </w:r>
+          </w:p>
+        </w:tc>
+      </w:tr>
+      <w:tr>
+        <w:trPr>
+          <w:tblHeader w:val="off"/>
+        </w:trPr>
+        <w:tc>
+          <w:tcPr>
+            <w:tcW w:type="dxa" w:w="2300"/>
+            <w:tcBorders>
+              <w:top w:val="single" w:color="BFBFBF" w:sz="4"/>
+              <w:left w:val="single" w:color="BFBFBF" w:sz="4"/>
+              <w:bottom w:val="single" w:color="BFBFBF" w:sz="4"/>
+              <w:right w:val="single" w:color="BFBFBF" w:sz="4"/>
+            </w:tcBorders>
+            <w:tcMar>
+              <w:top w:type="dxa" w:w="60"/>
+              <w:left w:type="dxa" w:w="100"/>
+              <w:bottom w:type="dxa" w:w="60"/>
+              <w:right w:type="dxa" w:w="100"/>
+            </w:tcMar>
+          </w:tcPr>
+          <w:p>
+            <w:r>
+              <w:rPr>
+                <w:sz w:val="19"/>
+                <w:szCs w:val="19"/>
+              </w:rPr>
+              <w:t xml:space="preserve">Timeline</w:t>
+            </w:r>
+          </w:p>
+        </w:tc>
+        <w:tc>
+          <w:tcPr>
+            <w:tcW w:type="dxa" w:w="4860"/>
+            <w:tcBorders>
+              <w:top w:val="single" w:color="BFBFBF" w:sz="4"/>
+              <w:left w:val="single" w:color="BFBFBF" w:sz="4"/>
+              <w:bottom w:val="single" w:color="BFBFBF" w:sz="4"/>
+              <w:right w:val="single" w:color="BFBFBF" w:sz="4"/>
+            </w:tcBorders>
+            <w:tcMar>
+              <w:top w:type="dxa" w:w="60"/>
+              <w:left w:type="dxa" w:w="100"/>
+              <w:bottom w:type="dxa" w:w="60"/>
+              <w:right w:type="dxa" w:w="100"/>
+            </w:tcMar>
+          </w:tcPr>
+          <w:p>
+            <w:r>
+              <w:rPr>
+                <w:sz w:val="19"/>
+                <w:szCs w:val="19"/>
+              </w:rPr>
+              <w:t xml:space="preserve">Per developer: release, independent evaluations, label changes; save as a report</w:t>
+            </w:r>
+          </w:p>
+        </w:tc>
+        <w:tc>
+          <w:tcPr>
+            <w:tcW w:type="dxa" w:w="2200"/>
+            <w:tcBorders>
+              <w:top w:val="single" w:color="BFBFBF" w:sz="4"/>
+              <w:left w:val="single" w:color="BFBFBF" w:sz="4"/>
+              <w:bottom w:val="single" w:color="BFBFBF" w:sz="4"/>
+              <w:right w:val="single" w:color="BFBFBF" w:sz="4"/>
+            </w:tcBorders>
+            <w:tcMar>
+              <w:top w:type="dxa" w:w="60"/>
+              <w:left w:type="dxa" w:w="100"/>
+              <w:bottom w:type="dxa" w:w="60"/>
+              <w:right w:type="dxa" w:w="100"/>
+            </w:tcMar>
+          </w:tcPr>
+          <w:p>
+            <w:r>
+              <w:rPr>
+                <w:sz w:val="19"/>
+                <w:szCs w:val="19"/>
+              </w:rPr>
+              <w:t xml:space="preserve">0</w:t>
+            </w:r>
+          </w:p>
+        </w:tc>
+      </w:tr>
+    </w:tbl>
+    <w:p>
+      <w:pPr>
+        <w:spacing w:after="200" w:before="60"/>
+      </w:pPr>
+      <w:r>
+        <w:rPr>
+          <w:i/>
+          <w:iCs/>
+          <w:color w:val="555555"/>
+          <w:sz w:val="18"/>
+          <w:szCs w:val="18"/>
+        </w:rPr>
+        <w:t xml:space="preserve">Table 9. Tabs of the Technology page.</w:t>
+      </w:r>
+    </w:p>
+    <w:p>
+      <w:pPr>
+        <w:spacing w:after="120"/>
+      </w:pPr>
+      <w:r>
+        <w:t xml:space="preserve">The model is chosen in a </w:t>
+      </w:r>
+      <w:r>
+        <w:rPr>
+          <w:rFonts w:ascii="Consolas" w:cs="Consolas" w:eastAsia="Consolas" w:hAnsi="Consolas"/>
+          <w:sz w:val="19"/>
+          <w:szCs w:val="19"/>
+        </w:rPr>
+        <w:t xml:space="preserve">.env</w:t>
+      </w:r>
+      <w:r>
+        <w:t xml:space="preserve"> file: DeepSeek (default), the Anthropic API, any OpenAI-compatible endpoint, or the Claude Code CLI. Every call is metered by tokens at list price, and each report ends with its calls, model and cost. </w:t>
+      </w:r>
+      <w:r>
+        <w:rPr>
+          <w:rFonts w:ascii="Consolas" w:cs="Consolas" w:eastAsia="Consolas" w:hAnsi="Consolas"/>
+          <w:sz w:val="19"/>
+          <w:szCs w:val="19"/>
+        </w:rPr>
+        <w:t xml:space="preserve">doctor</w:t>
+      </w:r>
+      <w:r>
+        <w:t xml:space="preserve"> checks the setup before anything is spent: the Python version, the key (by listing models, which is free), that every approved source answers, and a rough cost per command.</w:t>
+      </w:r>
+    </w:p>
+    <w:p>
+      <w:pPr>
         <w:pStyle w:val="Heading1"/>
       </w:pPr>
       <w:r>
@@ -4128,7 +5580,18 @@
         <w:spacing w:after="120"/>
       </w:pPr>
       <w:r>
-        <w:t xml:space="preserve">All runs below used live sources on October 25, 2026. Model calls went to Claude Sonnet 5.5 through the Claude Code CLI on a subscription plan; dollar figures are list-price equivalents reported by the CLI, not amounts billed.</w:t>
+        <w:t xml:space="preserve">All runs below used live sources on October 25, 2026. Sections 4.1 to 4.3 used Claude Sonnet 5.5 through the Claude Code CLI on a subscription plan; their dollar figures are list-price equivalents reported by the CLI, not amounts billed. Sections 4.4 and 4.5 used DeepSeek (</w:t>
+      </w:r>
+      <w:r>
+        <w:rPr>
+          <w:rFonts w:ascii="Consolas" w:cs="Consolas" w:eastAsia="Consolas" w:hAnsi="Consolas"/>
+          <w:sz w:val="19"/>
+          <w:szCs w:val="19"/>
+        </w:rPr>
+        <w:t xml:space="preserve">deepseek-flash</w:t>
+      </w:r>
+      <w:r>
+        <w:t xml:space="preserve">) through its API, metered at list price.</w:t>
       </w:r>
     </w:p>
     <w:p>
@@ -4751,7 +6214,7 @@
           <w:sz w:val="18"/>
           <w:szCs w:val="18"/>
         </w:rPr>
-        <w:t xml:space="preserve">Table 8. The same saved question before and after connecting Epoch AI, LMArena, Artificial Analysis and METR.</w:t>
+        <w:t xml:space="preserve">Table 10. The same saved question before and after connecting Epoch AI, LMArena, Artificial Analysis and METR.</w:t>
       </w:r>
     </w:p>
     <w:p>
@@ -4877,7 +6340,7 @@
         <w:pStyle w:val="Heading2"/>
       </w:pPr>
       <w:r>
-        <w:t xml:space="preserve">4.4 Offline tests</w:t>
+        <w:t xml:space="preserve">4.4 A fresh clone with DeepSeek</w:t>
       </w:r>
     </w:p>
     <w:p>
@@ -4885,7 +6348,121 @@
         <w:spacing w:after="120"/>
       </w:pPr>
       <w:r>
-        <w:t xml:space="preserve">Nineteen offline tests run without network or model calls (</w:t>
+        <w:t xml:space="preserve">To check that the project reproduces, it was cloned from GitHub into an empty folder and set up only through </w:t>
+      </w:r>
+      <w:r>
+        <w:rPr>
+          <w:rFonts w:ascii="Consolas" w:cs="Consolas" w:eastAsia="Consolas" w:hAnsi="Consolas"/>
+          <w:sz w:val="19"/>
+          <w:szCs w:val="19"/>
+        </w:rPr>
+        <w:t xml:space="preserve">.env</w:t>
+      </w:r>
+      <w:r>
+        <w:t xml:space="preserve"> with a DeepSeek key. </w:t>
+      </w:r>
+      <w:r>
+        <w:rPr>
+          <w:rFonts w:ascii="Consolas" w:cs="Consolas" w:eastAsia="Consolas" w:hAnsi="Consolas"/>
+          <w:sz w:val="19"/>
+          <w:szCs w:val="19"/>
+        </w:rPr>
+        <w:t xml:space="preserve">doctor</w:t>
+      </w:r>
+      <w:r>
+        <w:t xml:space="preserve"> passed. The first run read 35 items, 25 new, and checked 5 claims. Epoch AI’s own GPQA Diamond and FrontierMath results for DeepSeek V4.1 Flash, and its Cyber ECI finding for Z.ai’s GLM-5.3, were labelled independently verified; Moonshot’s Kimi K3.1 Pro claims stayed only the originator’s claim; an alert was drafted. The run took 8 model calls, $0.011 and 67 seconds.</w:t>
+      </w:r>
+    </w:p>
+    <w:p>
+      <w:pPr>
+        <w:spacing w:after="120"/>
+      </w:pPr>
+      <w:r>
+        <w:t xml:space="preserve">The same Kimi question as in Section 4.2 cost 2 calls ($0.002) and again cited both Artificial Analysis figures (Opus 5.5 Max 57.6, Kimi 55.1). The three learning levels cost 3 calls ($0.005). The whole session came to 13 calls and about $0.018, roughly twenty times cheaper than the same steps through Claude Sonnet 5.5 at list price. The behaviour reproduced; the wording and the exact news differed, as expected with live sources.</w:t>
+      </w:r>
+    </w:p>
+    <w:p>
+      <w:pPr>
+        <w:pStyle w:val="Heading2"/>
+      </w:pPr>
+      <w:r>
+        <w:t xml:space="preserve">4.5 Paper Decoder on a new preprint</w:t>
+      </w:r>
+    </w:p>
+    <w:p>
+      <w:pPr>
+        <w:spacing w:after="120"/>
+      </w:pPr>
+      <w:r>
+        <w:t xml:space="preserve">The decoder was tested on “On Task, Off Track: Benchmarking LLM and Agent Robustness to Near-Target Prompt Injection” (arXiv 2610.32531), one of the papers it recommended for the topic. arXiv had an HTML version, so it read the full text. One call cost $0.003.</w:t>
+      </w:r>
+    </w:p>
+    <w:p>
+      <w:pPr>
+        <w:spacing w:after="120"/>
+      </w:pPr>
+      <w:r>
+        <w:t xml:space="preserve">The output stated the hypothesis (resisting obvious prompt-injection attacks does not imply resisting attacks that only nudge an answer slightly wrong or harmful), the method (a new benchmark, NTBench, seven models, ten language datasets and two agent benchmarks, three attack attempts per sample) and five findings. Three numbers were spot-checked against the paper text and matched, for example that Meta-SecAlign-70B, a model trained to resist prompt injection, goes from 3.2% attack success on the baseline to 36.7% on near-target attacks. Limitations were mostly the authors’ own, applications were all marked “our reading, speculative”, and the relevance note said plainly that the paper bears on the topic only indirectly.</w:t>
+      </w:r>
+    </w:p>
+    <w:p>
+      <w:pPr>
+        <w:spacing w:after="120"/>
+      </w:pPr>
+      <w:r>
+        <w:t xml:space="preserve">One fault: the model listed “this is a preprint” as a limitation stated by the authors. The review status is already shown in the header, and the authors did not say it, so the prompt now tells the model not to list it.</w:t>
+      </w:r>
+    </w:p>
+    <w:p>
+      <w:pPr>
+        <w:pStyle w:val="Heading2"/>
+      </w:pPr>
+      <w:r>
+        <w:t xml:space="preserve">4.6 The timeline on the live ledger</w:t>
+      </w:r>
+    </w:p>
+    <w:p>
+      <w:pPr>
+        <w:spacing w:after="120"/>
+      </w:pPr>
+      <w:r>
+        <w:t xml:space="preserve">Built from the first live run’s ledger at no cost, the timeline shows DeepSeek publishing V4.1 Flash on Hugging Face on October 17 and Epoch AI’s own evaluation following on October 19, </w:t>
+      </w:r>
+      <w:r>
+        <w:rPr>
+          <w:b/>
+          <w:bCs/>
+        </w:rPr>
+        <w:t xml:space="preserve">1.7 days later</w:t>
+      </w:r>
+      <w:r>
+        <w:t xml:space="preserve">, then Newsren labelling both claims independently verified and drafting the briefing. For Moonshot, it shows the developer’s blog on October 23 and a commentator relaying it three hours later, and </w:t>
+      </w:r>
+      <w:r>
+        <w:rPr>
+          <w:b/>
+          <w:bCs/>
+        </w:rPr>
+        <w:t xml:space="preserve">no independent result yet</w:t>
+      </w:r>
+      <w:r>
+        <w:t xml:space="preserve">. For Muse Spark Open, Epoch’s evaluation is dated the same day as the developer’s blog post; Epoch gives only a day, so the order within that day is not known. The verifier did not identify that model’s developer, so the story is shown as “Developer not identified” rather than guessed.</w:t>
+      </w:r>
+    </w:p>
+    <w:p>
+      <w:pPr>
+        <w:pStyle w:val="Heading2"/>
+      </w:pPr>
+      <w:r>
+        <w:t xml:space="preserve">4.7 Offline tests</w:t>
+      </w:r>
+    </w:p>
+    <w:p>
+      <w:pPr>
+        <w:spacing w:after="120"/>
+      </w:pPr>
+      <w:r>
+        <w:t xml:space="preserve">Forty-two offline tests run without network or model calls (</w:t>
       </w:r>
       <w:r>
         <w:rPr>
@@ -4977,6 +6554,77 @@
       </w:r>
       <w:r>
         <w:t xml:space="preserve"> only real citations survive, labels are kept, every evaluation row reaches the answer, only verified claims are taught, error bars are read as standard errors.</w:t>
+      </w:r>
+    </w:p>
+    <w:p>
+      <w:pPr>
+        <w:pStyle w:val="ListParagraph"/>
+        <w:numPr>
+          <w:ilvl w:val="0"/>
+          <w:numId w:val="2"/>
+        </w:numPr>
+        <w:spacing w:after="60"/>
+      </w:pPr>
+      <w:r>
+        <w:rPr>
+          <w:b/>
+          <w:bCs/>
+        </w:rPr>
+        <w:t xml:space="preserve">Paper Decoder (5):</w:t>
+      </w:r>
+      <w:r>
+        <w:t xml:space="preserve"> arXiv ids and links are parsed and other domains refused; one call; invented citations stripped; preprint status shown; abstract-only and journal-reference cases; recommendations without the model.</w:t>
+      </w:r>
+    </w:p>
+    <w:p>
+      <w:pPr>
+        <w:pStyle w:val="ListParagraph"/>
+        <w:numPr>
+          <w:ilvl w:val="0"/>
+          <w:numId w:val="2"/>
+        </w:numPr>
+        <w:spacing w:after="60"/>
+      </w:pPr>
+      <w:r>
+        <w:rPr>
+          <w:b/>
+          <w:bCs/>
+        </w:rPr>
+        <w:t xml:space="preserve">Timeline (4):</w:t>
+      </w:r>
+      <w:r>
+        <w:t xml:space="preserve"> event order and kinds, one node per source, label events only on a change, briefing events, the launch-to-evaluation delay, no model calls.</w:t>
+      </w:r>
+    </w:p>
+    <w:p>
+      <w:pPr>
+        <w:pStyle w:val="ListParagraph"/>
+        <w:numPr>
+          <w:ilvl w:val="0"/>
+          <w:numId w:val="2"/>
+        </w:numPr>
+        <w:spacing w:after="60"/>
+      </w:pPr>
+      <w:r>
+        <w:rPr>
+          <w:b/>
+          <w:bCs/>
+        </w:rPr>
+        <w:t xml:space="preserve">Setup and web page (14):</w:t>
+      </w:r>
+      <w:r>
+        <w:t xml:space="preserve"> </w:t>
+      </w:r>
+      <w:r>
+        <w:rPr>
+          <w:rFonts w:ascii="Consolas" w:cs="Consolas" w:eastAsia="Consolas" w:hAnsi="Consolas"/>
+          <w:sz w:val="19"/>
+          <w:szCs w:val="19"/>
+        </w:rPr>
+        <w:t xml:space="preserve">.env</w:t>
+      </w:r>
+      <w:r>
+        <w:t xml:space="preserve"> loading, provider selection and cost meters, the Markdown renderer, every tab renders with an empty ledger, only Technology is clickable, the timeline button writes a report without the model, and only listed reports can be opened.</w:t>
       </w:r>
     </w:p>
     <w:p>
@@ -5325,7 +6973,7 @@
                 <w:sz w:val="19"/>
                 <w:szCs w:val="19"/>
               </w:rPr>
-              <w:t xml:space="preserve">Three levels generated from verified facts; one statistical misreading found and fixed.</w:t>
+              <w:t xml:space="preserve">Three levels generated from verified facts; one statistical misreading found and fixed. The Paper Decoder separates the authors’ claims from the agent’s reading.</w:t>
             </w:r>
           </w:p>
         </w:tc>
@@ -5351,7 +6999,7 @@
                 <w:sz w:val="19"/>
                 <w:szCs w:val="19"/>
               </w:rPr>
-              <w:t xml:space="preserve">Comprehension and transfer quiz results versus reading an ordinary summary.</w:t>
+              <w:t xml:space="preserve">Comprehension and transfer quiz results versus reading an ordinary summary or abstract.</w:t>
             </w:r>
           </w:p>
         </w:tc>
@@ -5574,7 +7222,7 @@
                 <w:sz w:val="19"/>
                 <w:szCs w:val="19"/>
               </w:rPr>
-              <w:t xml:space="preserve">Per run: 8 calls, about $0.22, 85 s. Per question: 2 calls, about $0.03–0.04. Per learning level: 1 call.</w:t>
+              <w:t xml:space="preserve">With Claude Sonnet 5.5: a run is 8 calls, about $0.22. With DeepSeek: a run $0.011, a question $0.002, three learning levels $0.005, a paper $0.003. The timeline costs nothing.</w:t>
             </w:r>
           </w:p>
         </w:tc>
@@ -5618,7 +7266,7 @@
           <w:sz w:val="18"/>
           <w:szCs w:val="18"/>
         </w:rPr>
-        <w:t xml:space="preserve">Table 9. Success metrics.</w:t>
+        <w:t xml:space="preserve">Table 11. Success metrics.</w:t>
       </w:r>
     </w:p>
     <w:p>
@@ -5723,10 +7371,50 @@
           <w:b/>
           <w:bCs/>
         </w:rPr>
+        <w:t xml:space="preserve">Timeline coverage.</w:t>
+      </w:r>
+      <w:r>
+        <w:t xml:space="preserve"> The timeline shows only what Newsren’s runs found, so a missing step means unseen, not absent. Stories are grouped by developer, not clustered (§2.2).</w:t>
+      </w:r>
+    </w:p>
+    <w:p>
+      <w:pPr>
+        <w:pStyle w:val="ListParagraph"/>
+        <w:numPr>
+          <w:ilvl w:val="0"/>
+          <w:numId w:val="2"/>
+        </w:numPr>
+        <w:spacing w:after="60"/>
+      </w:pPr>
+      <w:r>
+        <w:rPr>
+          <w:b/>
+          <w:bCs/>
+        </w:rPr>
+        <w:t xml:space="preserve">Paper Decoder input.</w:t>
+      </w:r>
+      <w:r>
+        <w:t xml:space="preserve"> It reads arXiv’s HTML version, cut at 30,000 characters; PDF-only papers are decoded from the abstract. Its findings are the authors’ claims and are not checked against other work.</w:t>
+      </w:r>
+    </w:p>
+    <w:p>
+      <w:pPr>
+        <w:pStyle w:val="ListParagraph"/>
+        <w:numPr>
+          <w:ilvl w:val="0"/>
+          <w:numId w:val="2"/>
+        </w:numPr>
+        <w:spacing w:after="60"/>
+      </w:pPr>
+      <w:r>
+        <w:rPr>
+          <w:b/>
+          <w:bCs/>
+        </w:rPr>
         <w:t xml:space="preserve">Not built:</w:t>
       </w:r>
       <w:r>
-        <w:t xml:space="preserve"> Research Paper Decoder, a story timeline view (§2.2), a web interface with the plan’s “Explain for” selector (§5), scheduled runs and email delivery.</w:t>
+        <w:t xml:space="preserve"> scheduled runs and email delivery. The web page is a local, single-user view, not a public site.</w:t>
       </w:r>
     </w:p>
     <w:p>
@@ -5742,7 +7430,7 @@
         <w:spacing w:after="120"/>
       </w:pPr>
       <w:r>
-        <w:t xml:space="preserve">The prototype shows that the plan’s Technology vertical can be built as a controlled agent rather than a chatbot: a saved question, approved tools, rule-based evidence labels, and a human gate. On live data it separated an independent evaluator’s measurements from a developer’s self-reported benchmarks, alerted only when the reader’s condition was met, and said plainly what it could not establish. Checking real outputs also found two problems (a lookup limit that hid the comparison a reader asked for, and a loose reading of error bars). Both were fixed and are now covered by tests. The general lesson matches the plan’s closing line: automate the repetitive research, and keep source accountability and editorial judgment in charge.</w:t>
+        <w:t xml:space="preserve">The prototype shows that the plan’s Technology vertical can be built as a controlled agent rather than a chatbot: a saved question, approved tools, rule-based evidence labels, and a human gate. On live data it separated an independent evaluator’s measurements from a developer’s self-reported benchmarks, alerted only when the reader’s condition was met, and said plainly what it could not establish. The same design carried over to the Paper Decoder (the authors’ claims kept apart from the agent’s reading) and to the timeline, which needed no model at all because the evidence record already held the dates. Checking real outputs also found two problems (a lookup limit that hid the comparison a reader asked for, and a loose reading of error bars). Both were fixed and are now covered by tests. The general lesson matches the plan’s closing line: automate the repetitive research, and keep source accountability and editorial judgment in charge.</w:t>
       </w:r>
     </w:p>
     <w:p>
@@ -5758,7 +7446,7 @@
         <w:spacing w:after="120"/>
       </w:pPr>
       <w:r>
-        <w:t xml:space="preserve">Python 3.10+, no third-party packages. Model access through the Claude Code CLI (</w:t>
+        <w:t xml:space="preserve">Python 3.10+, no third-party packages. Code: https://github.com/RorschachLin123/newsren-tech. Copy </w:t>
       </w:r>
       <w:r>
         <w:rPr>
@@ -5766,10 +7454,10 @@
           <w:sz w:val="19"/>
           <w:szCs w:val="19"/>
         </w:rPr>
-        <w:t xml:space="preserve">claude -p</w:t>
-      </w:r>
-      <w:r>
-        <w:t xml:space="preserve">, default) or the Anthropic API when </w:t>
+        <w:t xml:space="preserve">.env.example</w:t>
+      </w:r>
+      <w:r>
+        <w:t xml:space="preserve"> to </w:t>
       </w:r>
       <w:r>
         <w:rPr>
@@ -5777,10 +7465,10 @@
           <w:sz w:val="19"/>
           <w:szCs w:val="19"/>
         </w:rPr>
-        <w:t xml:space="preserve">ANTHROPIC_API_KEY</w:t>
-      </w:r>
-      <w:r>
-        <w:t xml:space="preserve"> is set.</w:t>
+        <w:t xml:space="preserve">.env</w:t>
+      </w:r>
+      <w:r>
+        <w:t xml:space="preserve"> and fill in one provider: DeepSeek (default), the Anthropic API, any OpenAI-compatible endpoint, or the Claude Code CLI.</w:t>
       </w:r>
     </w:p>
     <w:tbl>
@@ -5891,7 +7579,7 @@
                 <w:sz w:val="19"/>
                 <w:szCs w:val="19"/>
               </w:rPr>
-              <w:t xml:space="preserve">python3 newsren.py run independent-model-evals</w:t>
+              <w:t xml:space="preserve">python3 newsren.py doctor</w:t>
             </w:r>
           </w:p>
         </w:tc>
@@ -5917,7 +7605,7 @@
                 <w:sz w:val="19"/>
                 <w:szCs w:val="19"/>
               </w:rPr>
-              <w:t xml:space="preserve">One Follow a Topic run</w:t>
+              <w:t xml:space="preserve">Check Python, the key, every source and costs (no model calls)</w:t>
             </w:r>
           </w:p>
         </w:tc>
@@ -5949,7 +7637,7 @@
                 <w:sz w:val="19"/>
                 <w:szCs w:val="19"/>
               </w:rPr>
-              <w:t xml:space="preserve">python3 newsren.py pending</w:t>
+              <w:t xml:space="preserve">python3 newsren.py serve</w:t>
             </w:r>
           </w:p>
         </w:tc>
@@ -5975,7 +7663,7 @@
                 <w:sz w:val="19"/>
                 <w:szCs w:val="19"/>
               </w:rPr>
-              <w:t xml:space="preserve">List drafts waiting for review</w:t>
+              <w:t xml:space="preserve">Local web page at http://127.0.0.1:8000</w:t>
             </w:r>
           </w:p>
         </w:tc>
@@ -6007,7 +7695,7 @@
                 <w:sz w:val="19"/>
                 <w:szCs w:val="19"/>
               </w:rPr>
-              <w:t xml:space="preserve">python3 newsren.py approve &lt;topic&gt; &lt;id&gt; --editor &lt;name&gt;</w:t>
+              <w:t xml:space="preserve">python3 newsren.py run independent-model-evals</w:t>
             </w:r>
           </w:p>
         </w:tc>
@@ -6033,7 +7721,7 @@
                 <w:sz w:val="19"/>
                 <w:szCs w:val="19"/>
               </w:rPr>
-              <w:t xml:space="preserve">Editorial approval and delivery</w:t>
+              <w:t xml:space="preserve">One Follow a Topic run</w:t>
             </w:r>
           </w:p>
         </w:tc>
@@ -6065,7 +7753,7 @@
                 <w:sz w:val="19"/>
                 <w:szCs w:val="19"/>
               </w:rPr>
-              <w:t xml:space="preserve">python3 newsren.py ask &lt;topic&gt; "question"</w:t>
+              <w:t xml:space="preserve">python3 newsren.py pending</w:t>
             </w:r>
           </w:p>
         </w:tc>
@@ -6091,7 +7779,7 @@
                 <w:sz w:val="19"/>
                 <w:szCs w:val="19"/>
               </w:rPr>
-              <w:t xml:space="preserve">Ask Newsren</w:t>
+              <w:t xml:space="preserve">List drafts waiting for review</w:t>
             </w:r>
           </w:p>
         </w:tc>
@@ -6123,7 +7811,7 @@
                 <w:sz w:val="19"/>
                 <w:szCs w:val="19"/>
               </w:rPr>
-              <w:t xml:space="preserve">python3 newsren.py learn &lt;topic&gt; &lt;id&gt; --level student</w:t>
+              <w:t xml:space="preserve">python3 newsren.py approve &lt;topic&gt; &lt;id&gt; --editor &lt;name&gt;</w:t>
             </w:r>
           </w:p>
         </w:tc>
@@ -6149,7 +7837,7 @@
                 <w:sz w:val="19"/>
                 <w:szCs w:val="19"/>
               </w:rPr>
-              <w:t xml:space="preserve">News-to-Learning</w:t>
+              <w:t xml:space="preserve">Editorial approval and delivery</w:t>
             </w:r>
           </w:p>
         </w:tc>
@@ -6181,6 +7869,296 @@
                 <w:sz w:val="19"/>
                 <w:szCs w:val="19"/>
               </w:rPr>
+              <w:t xml:space="preserve">python3 newsren.py ask &lt;topic&gt; "question"</w:t>
+            </w:r>
+          </w:p>
+        </w:tc>
+        <w:tc>
+          <w:tcPr>
+            <w:tcW w:type="dxa" w:w="4160"/>
+            <w:tcBorders>
+              <w:top w:val="single" w:color="BFBFBF" w:sz="4"/>
+              <w:left w:val="single" w:color="BFBFBF" w:sz="4"/>
+              <w:bottom w:val="single" w:color="BFBFBF" w:sz="4"/>
+              <w:right w:val="single" w:color="BFBFBF" w:sz="4"/>
+            </w:tcBorders>
+            <w:tcMar>
+              <w:top w:type="dxa" w:w="60"/>
+              <w:left w:type="dxa" w:w="100"/>
+              <w:bottom w:type="dxa" w:w="60"/>
+              <w:right w:type="dxa" w:w="100"/>
+            </w:tcMar>
+          </w:tcPr>
+          <w:p>
+            <w:r>
+              <w:rPr>
+                <w:sz w:val="19"/>
+                <w:szCs w:val="19"/>
+              </w:rPr>
+              <w:t xml:space="preserve">Ask Newsren</w:t>
+            </w:r>
+          </w:p>
+        </w:tc>
+      </w:tr>
+      <w:tr>
+        <w:trPr>
+          <w:tblHeader w:val="off"/>
+        </w:trPr>
+        <w:tc>
+          <w:tcPr>
+            <w:tcW w:type="dxa" w:w="5200"/>
+            <w:tcBorders>
+              <w:top w:val="single" w:color="BFBFBF" w:sz="4"/>
+              <w:left w:val="single" w:color="BFBFBF" w:sz="4"/>
+              <w:bottom w:val="single" w:color="BFBFBF" w:sz="4"/>
+              <w:right w:val="single" w:color="BFBFBF" w:sz="4"/>
+            </w:tcBorders>
+            <w:tcMar>
+              <w:top w:type="dxa" w:w="60"/>
+              <w:left w:type="dxa" w:w="100"/>
+              <w:bottom w:type="dxa" w:w="60"/>
+              <w:right w:type="dxa" w:w="100"/>
+            </w:tcMar>
+          </w:tcPr>
+          <w:p>
+            <w:r>
+              <w:rPr>
+                <w:rFonts w:ascii="Consolas" w:cs="Consolas" w:eastAsia="Consolas" w:hAnsi="Consolas"/>
+                <w:sz w:val="19"/>
+                <w:szCs w:val="19"/>
+              </w:rPr>
+              <w:t xml:space="preserve">python3 newsren.py learn &lt;topic&gt; &lt;id&gt; --level student</w:t>
+            </w:r>
+          </w:p>
+        </w:tc>
+        <w:tc>
+          <w:tcPr>
+            <w:tcW w:type="dxa" w:w="4160"/>
+            <w:tcBorders>
+              <w:top w:val="single" w:color="BFBFBF" w:sz="4"/>
+              <w:left w:val="single" w:color="BFBFBF" w:sz="4"/>
+              <w:bottom w:val="single" w:color="BFBFBF" w:sz="4"/>
+              <w:right w:val="single" w:color="BFBFBF" w:sz="4"/>
+            </w:tcBorders>
+            <w:tcMar>
+              <w:top w:type="dxa" w:w="60"/>
+              <w:left w:type="dxa" w:w="100"/>
+              <w:bottom w:type="dxa" w:w="60"/>
+              <w:right w:type="dxa" w:w="100"/>
+            </w:tcMar>
+          </w:tcPr>
+          <w:p>
+            <w:r>
+              <w:rPr>
+                <w:sz w:val="19"/>
+                <w:szCs w:val="19"/>
+              </w:rPr>
+              <w:t xml:space="preserve">News-to-Learning</w:t>
+            </w:r>
+          </w:p>
+        </w:tc>
+      </w:tr>
+      <w:tr>
+        <w:trPr>
+          <w:tblHeader w:val="off"/>
+        </w:trPr>
+        <w:tc>
+          <w:tcPr>
+            <w:tcW w:type="dxa" w:w="5200"/>
+            <w:tcBorders>
+              <w:top w:val="single" w:color="BFBFBF" w:sz="4"/>
+              <w:left w:val="single" w:color="BFBFBF" w:sz="4"/>
+              <w:bottom w:val="single" w:color="BFBFBF" w:sz="4"/>
+              <w:right w:val="single" w:color="BFBFBF" w:sz="4"/>
+            </w:tcBorders>
+            <w:tcMar>
+              <w:top w:type="dxa" w:w="60"/>
+              <w:left w:type="dxa" w:w="100"/>
+              <w:bottom w:type="dxa" w:w="60"/>
+              <w:right w:type="dxa" w:w="100"/>
+            </w:tcMar>
+          </w:tcPr>
+          <w:p>
+            <w:r>
+              <w:rPr>
+                <w:rFonts w:ascii="Consolas" w:cs="Consolas" w:eastAsia="Consolas" w:hAnsi="Consolas"/>
+                <w:sz w:val="19"/>
+                <w:szCs w:val="19"/>
+              </w:rPr>
+              <w:t xml:space="preserve">python3 newsren.py decode &lt;arXiv id or link&gt;</w:t>
+            </w:r>
+          </w:p>
+        </w:tc>
+        <w:tc>
+          <w:tcPr>
+            <w:tcW w:type="dxa" w:w="4160"/>
+            <w:tcBorders>
+              <w:top w:val="single" w:color="BFBFBF" w:sz="4"/>
+              <w:left w:val="single" w:color="BFBFBF" w:sz="4"/>
+              <w:bottom w:val="single" w:color="BFBFBF" w:sz="4"/>
+              <w:right w:val="single" w:color="BFBFBF" w:sz="4"/>
+            </w:tcBorders>
+            <w:tcMar>
+              <w:top w:type="dxa" w:w="60"/>
+              <w:left w:type="dxa" w:w="100"/>
+              <w:bottom w:type="dxa" w:w="60"/>
+              <w:right w:type="dxa" w:w="100"/>
+            </w:tcMar>
+          </w:tcPr>
+          <w:p>
+            <w:r>
+              <w:rPr>
+                <w:sz w:val="19"/>
+                <w:szCs w:val="19"/>
+              </w:rPr>
+              <w:t xml:space="preserve">Research Paper Decoder (1 call)</w:t>
+            </w:r>
+          </w:p>
+        </w:tc>
+      </w:tr>
+      <w:tr>
+        <w:trPr>
+          <w:tblHeader w:val="off"/>
+        </w:trPr>
+        <w:tc>
+          <w:tcPr>
+            <w:tcW w:type="dxa" w:w="5200"/>
+            <w:tcBorders>
+              <w:top w:val="single" w:color="BFBFBF" w:sz="4"/>
+              <w:left w:val="single" w:color="BFBFBF" w:sz="4"/>
+              <w:bottom w:val="single" w:color="BFBFBF" w:sz="4"/>
+              <w:right w:val="single" w:color="BFBFBF" w:sz="4"/>
+            </w:tcBorders>
+            <w:tcMar>
+              <w:top w:type="dxa" w:w="60"/>
+              <w:left w:type="dxa" w:w="100"/>
+              <w:bottom w:type="dxa" w:w="60"/>
+              <w:right w:type="dxa" w:w="100"/>
+            </w:tcMar>
+          </w:tcPr>
+          <w:p>
+            <w:r>
+              <w:rPr>
+                <w:rFonts w:ascii="Consolas" w:cs="Consolas" w:eastAsia="Consolas" w:hAnsi="Consolas"/>
+                <w:sz w:val="19"/>
+                <w:szCs w:val="19"/>
+              </w:rPr>
+              <w:t xml:space="preserve">python3 newsren.py papers</w:t>
+            </w:r>
+          </w:p>
+        </w:tc>
+        <w:tc>
+          <w:tcPr>
+            <w:tcW w:type="dxa" w:w="4160"/>
+            <w:tcBorders>
+              <w:top w:val="single" w:color="BFBFBF" w:sz="4"/>
+              <w:left w:val="single" w:color="BFBFBF" w:sz="4"/>
+              <w:bottom w:val="single" w:color="BFBFBF" w:sz="4"/>
+              <w:right w:val="single" w:color="BFBFBF" w:sz="4"/>
+            </w:tcBorders>
+            <w:tcMar>
+              <w:top w:type="dxa" w:w="60"/>
+              <w:left w:type="dxa" w:w="100"/>
+              <w:bottom w:type="dxa" w:w="60"/>
+              <w:right w:type="dxa" w:w="100"/>
+            </w:tcMar>
+          </w:tcPr>
+          <w:p>
+            <w:r>
+              <w:rPr>
+                <w:sz w:val="19"/>
+                <w:szCs w:val="19"/>
+              </w:rPr>
+              <w:t xml:space="preserve">Recommended papers (no model calls)</w:t>
+            </w:r>
+          </w:p>
+        </w:tc>
+      </w:tr>
+      <w:tr>
+        <w:trPr>
+          <w:tblHeader w:val="off"/>
+        </w:trPr>
+        <w:tc>
+          <w:tcPr>
+            <w:tcW w:type="dxa" w:w="5200"/>
+            <w:tcBorders>
+              <w:top w:val="single" w:color="BFBFBF" w:sz="4"/>
+              <w:left w:val="single" w:color="BFBFBF" w:sz="4"/>
+              <w:bottom w:val="single" w:color="BFBFBF" w:sz="4"/>
+              <w:right w:val="single" w:color="BFBFBF" w:sz="4"/>
+            </w:tcBorders>
+            <w:tcMar>
+              <w:top w:type="dxa" w:w="60"/>
+              <w:left w:type="dxa" w:w="100"/>
+              <w:bottom w:type="dxa" w:w="60"/>
+              <w:right w:type="dxa" w:w="100"/>
+            </w:tcMar>
+          </w:tcPr>
+          <w:p>
+            <w:r>
+              <w:rPr>
+                <w:rFonts w:ascii="Consolas" w:cs="Consolas" w:eastAsia="Consolas" w:hAnsi="Consolas"/>
+                <w:sz w:val="19"/>
+                <w:szCs w:val="19"/>
+              </w:rPr>
+              <w:t xml:space="preserve">python3 newsren.py timeline</w:t>
+            </w:r>
+          </w:p>
+        </w:tc>
+        <w:tc>
+          <w:tcPr>
+            <w:tcW w:type="dxa" w:w="4160"/>
+            <w:tcBorders>
+              <w:top w:val="single" w:color="BFBFBF" w:sz="4"/>
+              <w:left w:val="single" w:color="BFBFBF" w:sz="4"/>
+              <w:bottom w:val="single" w:color="BFBFBF" w:sz="4"/>
+              <w:right w:val="single" w:color="BFBFBF" w:sz="4"/>
+            </w:tcBorders>
+            <w:tcMar>
+              <w:top w:type="dxa" w:w="60"/>
+              <w:left w:type="dxa" w:w="100"/>
+              <w:bottom w:type="dxa" w:w="60"/>
+              <w:right w:type="dxa" w:w="100"/>
+            </w:tcMar>
+          </w:tcPr>
+          <w:p>
+            <w:r>
+              <w:rPr>
+                <w:sz w:val="19"/>
+                <w:szCs w:val="19"/>
+              </w:rPr>
+              <w:t xml:space="preserve">Evolution timeline (no model calls)</w:t>
+            </w:r>
+          </w:p>
+        </w:tc>
+      </w:tr>
+      <w:tr>
+        <w:trPr>
+          <w:tblHeader w:val="off"/>
+        </w:trPr>
+        <w:tc>
+          <w:tcPr>
+            <w:tcW w:type="dxa" w:w="5200"/>
+            <w:tcBorders>
+              <w:top w:val="single" w:color="BFBFBF" w:sz="4"/>
+              <w:left w:val="single" w:color="BFBFBF" w:sz="4"/>
+              <w:bottom w:val="single" w:color="BFBFBF" w:sz="4"/>
+              <w:right w:val="single" w:color="BFBFBF" w:sz="4"/>
+            </w:tcBorders>
+            <w:tcMar>
+              <w:top w:type="dxa" w:w="60"/>
+              <w:left w:type="dxa" w:w="100"/>
+              <w:bottom w:type="dxa" w:w="60"/>
+              <w:right w:type="dxa" w:w="100"/>
+            </w:tcMar>
+          </w:tcPr>
+          <w:p>
+            <w:r>
+              <w:rPr>
+                <w:rFonts w:ascii="Consolas" w:cs="Consolas" w:eastAsia="Consolas" w:hAnsi="Consolas"/>
+                <w:sz w:val="19"/>
+                <w:szCs w:val="19"/>
+              </w:rPr>
               <w:t xml:space="preserve">python3 -m unittest discover tests</w:t>
             </w:r>
           </w:p>
@@ -6207,7 +8185,7 @@
                 <w:sz w:val="19"/>
                 <w:szCs w:val="19"/>
               </w:rPr>
-              <w:t xml:space="preserve">19 offline tests</w:t>
+              <w:t xml:space="preserve">42 offline tests</w:t>
             </w:r>
           </w:p>
         </w:tc>
@@ -6225,7 +8203,7 @@
           <w:sz w:val="18"/>
           <w:szCs w:val="18"/>
         </w:rPr>
-        <w:t xml:space="preserve">Table 10. Commands.</w:t>
+        <w:t xml:space="preserve">Table 12. Commands.</w:t>
       </w:r>
     </w:p>
     <w:tbl>
@@ -6742,6 +8720,253 @@
                 <w:sz w:val="19"/>
                 <w:szCs w:val="19"/>
               </w:rPr>
+              <w:t xml:space="preserve">newsren/papers.py</w:t>
+            </w:r>
+          </w:p>
+        </w:tc>
+        <w:tc>
+          <w:tcPr>
+            <w:tcW w:type="dxa" w:w="6360"/>
+            <w:tcBorders>
+              <w:top w:val="single" w:color="BFBFBF" w:sz="4"/>
+              <w:left w:val="single" w:color="BFBFBF" w:sz="4"/>
+              <w:bottom w:val="single" w:color="BFBFBF" w:sz="4"/>
+              <w:right w:val="single" w:color="BFBFBF" w:sz="4"/>
+            </w:tcBorders>
+            <w:tcMar>
+              <w:top w:type="dxa" w:w="60"/>
+              <w:left w:type="dxa" w:w="100"/>
+              <w:bottom w:type="dxa" w:w="60"/>
+              <w:right w:type="dxa" w:w="100"/>
+            </w:tcMar>
+          </w:tcPr>
+          <w:p>
+            <w:r>
+              <w:rPr>
+                <w:sz w:val="19"/>
+                <w:szCs w:val="19"/>
+              </w:rPr>
+              <w:t xml:space="preserve">Research Paper Decoder and paper recommendations</w:t>
+            </w:r>
+          </w:p>
+        </w:tc>
+      </w:tr>
+      <w:tr>
+        <w:trPr>
+          <w:tblHeader w:val="off"/>
+        </w:trPr>
+        <w:tc>
+          <w:tcPr>
+            <w:tcW w:type="dxa" w:w="3000"/>
+            <w:tcBorders>
+              <w:top w:val="single" w:color="BFBFBF" w:sz="4"/>
+              <w:left w:val="single" w:color="BFBFBF" w:sz="4"/>
+              <w:bottom w:val="single" w:color="BFBFBF" w:sz="4"/>
+              <w:right w:val="single" w:color="BFBFBF" w:sz="4"/>
+            </w:tcBorders>
+            <w:tcMar>
+              <w:top w:type="dxa" w:w="60"/>
+              <w:left w:type="dxa" w:w="100"/>
+              <w:bottom w:type="dxa" w:w="60"/>
+              <w:right w:type="dxa" w:w="100"/>
+            </w:tcMar>
+          </w:tcPr>
+          <w:p>
+            <w:r>
+              <w:rPr>
+                <w:rFonts w:ascii="Consolas" w:cs="Consolas" w:eastAsia="Consolas" w:hAnsi="Consolas"/>
+                <w:sz w:val="19"/>
+                <w:szCs w:val="19"/>
+              </w:rPr>
+              <w:t xml:space="preserve">newsren/timeline.py</w:t>
+            </w:r>
+          </w:p>
+        </w:tc>
+        <w:tc>
+          <w:tcPr>
+            <w:tcW w:type="dxa" w:w="6360"/>
+            <w:tcBorders>
+              <w:top w:val="single" w:color="BFBFBF" w:sz="4"/>
+              <w:left w:val="single" w:color="BFBFBF" w:sz="4"/>
+              <w:bottom w:val="single" w:color="BFBFBF" w:sz="4"/>
+              <w:right w:val="single" w:color="BFBFBF" w:sz="4"/>
+            </w:tcBorders>
+            <w:tcMar>
+              <w:top w:type="dxa" w:w="60"/>
+              <w:left w:type="dxa" w:w="100"/>
+              <w:bottom w:type="dxa" w:w="60"/>
+              <w:right w:type="dxa" w:w="100"/>
+            </w:tcMar>
+          </w:tcPr>
+          <w:p>
+            <w:r>
+              <w:rPr>
+                <w:sz w:val="19"/>
+                <w:szCs w:val="19"/>
+              </w:rPr>
+              <w:t xml:space="preserve">Technology Evolution Timeline from the ledger</w:t>
+            </w:r>
+          </w:p>
+        </w:tc>
+      </w:tr>
+      <w:tr>
+        <w:trPr>
+          <w:tblHeader w:val="off"/>
+        </w:trPr>
+        <w:tc>
+          <w:tcPr>
+            <w:tcW w:type="dxa" w:w="3000"/>
+            <w:tcBorders>
+              <w:top w:val="single" w:color="BFBFBF" w:sz="4"/>
+              <w:left w:val="single" w:color="BFBFBF" w:sz="4"/>
+              <w:bottom w:val="single" w:color="BFBFBF" w:sz="4"/>
+              <w:right w:val="single" w:color="BFBFBF" w:sz="4"/>
+            </w:tcBorders>
+            <w:tcMar>
+              <w:top w:type="dxa" w:w="60"/>
+              <w:left w:type="dxa" w:w="100"/>
+              <w:bottom w:type="dxa" w:w="60"/>
+              <w:right w:type="dxa" w:w="100"/>
+            </w:tcMar>
+          </w:tcPr>
+          <w:p>
+            <w:r>
+              <w:rPr>
+                <w:rFonts w:ascii="Consolas" w:cs="Consolas" w:eastAsia="Consolas" w:hAnsi="Consolas"/>
+                <w:sz w:val="19"/>
+                <w:szCs w:val="19"/>
+              </w:rPr>
+              <w:t xml:space="preserve">newsren/web.py</w:t>
+            </w:r>
+          </w:p>
+        </w:tc>
+        <w:tc>
+          <w:tcPr>
+            <w:tcW w:type="dxa" w:w="6360"/>
+            <w:tcBorders>
+              <w:top w:val="single" w:color="BFBFBF" w:sz="4"/>
+              <w:left w:val="single" w:color="BFBFBF" w:sz="4"/>
+              <w:bottom w:val="single" w:color="BFBFBF" w:sz="4"/>
+              <w:right w:val="single" w:color="BFBFBF" w:sz="4"/>
+            </w:tcBorders>
+            <w:tcMar>
+              <w:top w:type="dxa" w:w="60"/>
+              <w:left w:type="dxa" w:w="100"/>
+              <w:bottom w:type="dxa" w:w="60"/>
+              <w:right w:type="dxa" w:w="100"/>
+            </w:tcMar>
+          </w:tcPr>
+          <w:p>
+            <w:r>
+              <w:rPr>
+                <w:sz w:val="19"/>
+                <w:szCs w:val="19"/>
+              </w:rPr>
+              <w:t xml:space="preserve">Local web page, one tab per tool</w:t>
+            </w:r>
+          </w:p>
+        </w:tc>
+      </w:tr>
+      <w:tr>
+        <w:trPr>
+          <w:tblHeader w:val="off"/>
+        </w:trPr>
+        <w:tc>
+          <w:tcPr>
+            <w:tcW w:type="dxa" w:w="3000"/>
+            <w:tcBorders>
+              <w:top w:val="single" w:color="BFBFBF" w:sz="4"/>
+              <w:left w:val="single" w:color="BFBFBF" w:sz="4"/>
+              <w:bottom w:val="single" w:color="BFBFBF" w:sz="4"/>
+              <w:right w:val="single" w:color="BFBFBF" w:sz="4"/>
+            </w:tcBorders>
+            <w:tcMar>
+              <w:top w:type="dxa" w:w="60"/>
+              <w:left w:type="dxa" w:w="100"/>
+              <w:bottom w:type="dxa" w:w="60"/>
+              <w:right w:type="dxa" w:w="100"/>
+            </w:tcMar>
+          </w:tcPr>
+          <w:p>
+            <w:r>
+              <w:rPr>
+                <w:rFonts w:ascii="Consolas" w:cs="Consolas" w:eastAsia="Consolas" w:hAnsi="Consolas"/>
+                <w:sz w:val="19"/>
+                <w:szCs w:val="19"/>
+              </w:rPr>
+              <w:t xml:space="preserve">newsren/llm.py</w:t>
+            </w:r>
+            <w:r>
+              <w:rPr>
+                <w:sz w:val="19"/>
+                <w:szCs w:val="19"/>
+              </w:rPr>
+              <w:t xml:space="preserve">, </w:t>
+            </w:r>
+            <w:r>
+              <w:rPr>
+                <w:rFonts w:ascii="Consolas" w:cs="Consolas" w:eastAsia="Consolas" w:hAnsi="Consolas"/>
+                <w:sz w:val="19"/>
+                <w:szCs w:val="19"/>
+              </w:rPr>
+              <w:t xml:space="preserve">newsren/doctor.py</w:t>
+            </w:r>
+          </w:p>
+        </w:tc>
+        <w:tc>
+          <w:tcPr>
+            <w:tcW w:type="dxa" w:w="6360"/>
+            <w:tcBorders>
+              <w:top w:val="single" w:color="BFBFBF" w:sz="4"/>
+              <w:left w:val="single" w:color="BFBFBF" w:sz="4"/>
+              <w:bottom w:val="single" w:color="BFBFBF" w:sz="4"/>
+              <w:right w:val="single" w:color="BFBFBF" w:sz="4"/>
+            </w:tcBorders>
+            <w:tcMar>
+              <w:top w:type="dxa" w:w="60"/>
+              <w:left w:type="dxa" w:w="100"/>
+              <w:bottom w:type="dxa" w:w="60"/>
+              <w:right w:type="dxa" w:w="100"/>
+            </w:tcMar>
+          </w:tcPr>
+          <w:p>
+            <w:r>
+              <w:rPr>
+                <w:sz w:val="19"/>
+                <w:szCs w:val="19"/>
+              </w:rPr>
+              <w:t xml:space="preserve">Model providers and cost meter; setup check</w:t>
+            </w:r>
+          </w:p>
+        </w:tc>
+      </w:tr>
+      <w:tr>
+        <w:trPr>
+          <w:tblHeader w:val="off"/>
+        </w:trPr>
+        <w:tc>
+          <w:tcPr>
+            <w:tcW w:type="dxa" w:w="3000"/>
+            <w:tcBorders>
+              <w:top w:val="single" w:color="BFBFBF" w:sz="4"/>
+              <w:left w:val="single" w:color="BFBFBF" w:sz="4"/>
+              <w:bottom w:val="single" w:color="BFBFBF" w:sz="4"/>
+              <w:right w:val="single" w:color="BFBFBF" w:sz="4"/>
+            </w:tcBorders>
+            <w:tcMar>
+              <w:top w:type="dxa" w:w="60"/>
+              <w:left w:type="dxa" w:w="100"/>
+              <w:bottom w:type="dxa" w:w="60"/>
+              <w:right w:type="dxa" w:w="100"/>
+            </w:tcMar>
+          </w:tcPr>
+          <w:p>
+            <w:r>
+              <w:rPr>
+                <w:rFonts w:ascii="Consolas" w:cs="Consolas" w:eastAsia="Consolas" w:hAnsi="Consolas"/>
+                <w:sz w:val="19"/>
+                <w:szCs w:val="19"/>
+              </w:rPr>
               <w:t xml:space="preserve">out/independent-model-evals/</w:t>
             </w:r>
           </w:p>
@@ -6768,7 +8993,7 @@
                 <w:sz w:val="19"/>
                 <w:szCs w:val="19"/>
               </w:rPr>
-              <w:t xml:space="preserve">Live outputs: alert draft, answers, learning material</w:t>
+              <w:t xml:space="preserve">Live outputs: alert drafts, answers, learning material, decoded paper, timeline</w:t>
             </w:r>
           </w:p>
         </w:tc>
@@ -6786,7 +9011,7 @@
           <w:sz w:val="18"/>
           <w:szCs w:val="18"/>
         </w:rPr>
-        <w:t xml:space="preserve">Table 11. Code map.</w:t>
+        <w:t xml:space="preserve">Table 13. Code map.</w:t>
       </w:r>
     </w:p>
     <w:sectPr>

</xml_diff>